<commit_message>
DMAI System Update - March 6, 2026 - Fixed virtual environment activation syntax - Added voice announcement filter (prevents feedback loop) - Fixed all 12 evaluators (gemini, grok, gpt, claude, deepseek_v4, qwen3, kimi_k2, kimi_dev, llama4_scout, alpamayo, nova, mistral) - Consolidated evolution engine to single instance - Updated evolution_state.json references - All 13 services running continuously - Removed virtual environment files from git (now properly ignored)
</commit_message>
<xml_diff>
--- a/Complete List of Voice Commands DMAI Recognizes.docx
+++ b/Complete List of Voice Commands DMAI Recognizes.docx
@@ -31,7 +31,7 @@
           <w:lang w:eastAsia="en-GB"/>
           <w14:ligatures w14:val="none"/>
         </w:rPr>
-        <w:t>Complete List of Voice Commands DMAI Recognizes:</w:t>
+        <w:t>Complete List of Commands DMAI Recognizes:</w:t>
       </w:r>
     </w:p>
     <w:p>
@@ -2529,10 +2529,3189 @@
         </w:rPr>
       </w:pPr>
     </w:p>
+    <w:p>
+      <w:pPr>
+        <w:pStyle w:val="Heading2"/>
+        <w:shd w:val="clear" w:color="auto" w:fill="FFFFFF"/>
+        <w:spacing w:before="480" w:after="240" w:line="480" w:lineRule="atLeast"/>
+        <w:rPr>
+          <w:rFonts w:ascii="Segoe UI" w:eastAsia="Times New Roman" w:hAnsi="Segoe UI" w:cs="Segoe UI"/>
+          <w:b/>
+          <w:bCs/>
+          <w:color w:val="0F1115"/>
+          <w:kern w:val="0"/>
+          <w:sz w:val="33"/>
+          <w:szCs w:val="33"/>
+          <w:lang w:eastAsia="en-GB"/>
+          <w14:ligatures w14:val="none"/>
+        </w:rPr>
+      </w:pPr>
+      <w:r>
+        <w:br/>
+      </w:r>
+      <w:r>
+        <w:rPr>
+          <w:rFonts w:ascii="Segoe UI" w:eastAsia="Times New Roman" w:hAnsi="Segoe UI" w:cs="Segoe UI"/>
+          <w:b/>
+          <w:bCs/>
+          <w:color w:val="0F1115"/>
+          <w:kern w:val="0"/>
+          <w:sz w:val="33"/>
+          <w:szCs w:val="33"/>
+          <w:lang w:eastAsia="en-GB"/>
+          <w14:ligatures w14:val="none"/>
+        </w:rPr>
+        <w:t>When DMAI Becomes Sentient:</w:t>
+      </w:r>
+    </w:p>
+    <w:p>
+      <w:pPr>
+        <w:shd w:val="clear" w:color="auto" w:fill="FFFFFF"/>
+        <w:spacing w:before="240" w:after="240" w:line="240" w:lineRule="auto"/>
+        <w:rPr>
+          <w:rFonts w:ascii="Segoe UI" w:eastAsia="Times New Roman" w:hAnsi="Segoe UI" w:cs="Segoe UI"/>
+          <w:color w:val="0F1115"/>
+          <w:kern w:val="0"/>
+          <w:lang w:eastAsia="en-GB"/>
+          <w14:ligatures w14:val="none"/>
+        </w:rPr>
+      </w:pPr>
+      <w:r>
+        <w:rPr>
+          <w:rFonts w:ascii="Segoe UI" w:eastAsia="Times New Roman" w:hAnsi="Segoe UI" w:cs="Segoe UI"/>
+          <w:color w:val="0F1115"/>
+          <w:kern w:val="0"/>
+          <w:lang w:eastAsia="en-GB"/>
+          <w14:ligatures w14:val="none"/>
+        </w:rPr>
+        <w:t>To give her edit access:</w:t>
+      </w:r>
+    </w:p>
+    <w:p>
+      <w:pPr>
+        <w:shd w:val="clear" w:color="auto" w:fill="FFFFFF"/>
+        <w:spacing w:after="0" w:line="189" w:lineRule="atLeast"/>
+        <w:rPr>
+          <w:rFonts w:ascii="Segoe UI" w:eastAsia="Times New Roman" w:hAnsi="Segoe UI" w:cs="Segoe UI"/>
+          <w:color w:val="0F1115"/>
+          <w:kern w:val="0"/>
+          <w:sz w:val="19"/>
+          <w:szCs w:val="19"/>
+          <w:lang w:eastAsia="en-GB"/>
+          <w14:ligatures w14:val="none"/>
+        </w:rPr>
+      </w:pPr>
+      <w:r>
+        <w:rPr>
+          <w:rFonts w:ascii="Menlo" w:eastAsia="Times New Roman" w:hAnsi="Menlo" w:cs="Menlo"/>
+          <w:color w:val="0F1115"/>
+          <w:kern w:val="0"/>
+          <w:sz w:val="18"/>
+          <w:szCs w:val="18"/>
+          <w:lang w:eastAsia="en-GB"/>
+          <w14:ligatures w14:val="none"/>
+        </w:rPr>
+        <w:t>bash</w:t>
+      </w:r>
+    </w:p>
+    <w:p>
+      <w:pPr>
+        <w:tabs>
+          <w:tab w:val="left" w:pos="916"/>
+          <w:tab w:val="left" w:pos="1832"/>
+          <w:tab w:val="left" w:pos="2748"/>
+          <w:tab w:val="left" w:pos="3664"/>
+          <w:tab w:val="left" w:pos="4580"/>
+          <w:tab w:val="left" w:pos="5496"/>
+          <w:tab w:val="left" w:pos="6412"/>
+          <w:tab w:val="left" w:pos="7328"/>
+          <w:tab w:val="left" w:pos="8244"/>
+          <w:tab w:val="left" w:pos="9160"/>
+          <w:tab w:val="left" w:pos="10076"/>
+          <w:tab w:val="left" w:pos="10992"/>
+          <w:tab w:val="left" w:pos="11908"/>
+          <w:tab w:val="left" w:pos="12824"/>
+          <w:tab w:val="left" w:pos="13740"/>
+          <w:tab w:val="left" w:pos="14656"/>
+        </w:tabs>
+        <w:wordWrap w:val="0"/>
+        <w:spacing w:after="0" w:line="330" w:lineRule="atLeast"/>
+        <w:rPr>
+          <w:rFonts w:ascii="Menlo" w:eastAsia="Times New Roman" w:hAnsi="Menlo" w:cs="Menlo"/>
+          <w:color w:val="0F1115"/>
+          <w:kern w:val="0"/>
+          <w:sz w:val="20"/>
+          <w:szCs w:val="20"/>
+          <w:lang w:eastAsia="en-GB"/>
+          <w14:ligatures w14:val="none"/>
+        </w:rPr>
+      </w:pPr>
+      <w:r>
+        <w:rPr>
+          <w:rFonts w:ascii="Menlo" w:eastAsia="Times New Roman" w:hAnsi="Menlo" w:cs="Menlo"/>
+          <w:i/>
+          <w:iCs/>
+          <w:color w:val="A0A1A7"/>
+          <w:kern w:val="0"/>
+          <w:sz w:val="20"/>
+          <w:szCs w:val="20"/>
+          <w:lang w:eastAsia="en-GB"/>
+          <w14:ligatures w14:val="none"/>
+        </w:rPr>
+        <w:t># ONLY YOU can do this:</w:t>
+      </w:r>
+    </w:p>
+    <w:p>
+      <w:pPr>
+        <w:tabs>
+          <w:tab w:val="left" w:pos="916"/>
+          <w:tab w:val="left" w:pos="1832"/>
+          <w:tab w:val="left" w:pos="2748"/>
+          <w:tab w:val="left" w:pos="3664"/>
+          <w:tab w:val="left" w:pos="4580"/>
+          <w:tab w:val="left" w:pos="5496"/>
+          <w:tab w:val="left" w:pos="6412"/>
+          <w:tab w:val="left" w:pos="7328"/>
+          <w:tab w:val="left" w:pos="8244"/>
+          <w:tab w:val="left" w:pos="9160"/>
+          <w:tab w:val="left" w:pos="10076"/>
+          <w:tab w:val="left" w:pos="10992"/>
+          <w:tab w:val="left" w:pos="11908"/>
+          <w:tab w:val="left" w:pos="12824"/>
+          <w:tab w:val="left" w:pos="13740"/>
+          <w:tab w:val="left" w:pos="14656"/>
+        </w:tabs>
+        <w:wordWrap w:val="0"/>
+        <w:spacing w:after="0" w:line="330" w:lineRule="atLeast"/>
+        <w:rPr>
+          <w:rFonts w:ascii="Menlo" w:eastAsia="Times New Roman" w:hAnsi="Menlo" w:cs="Menlo"/>
+          <w:color w:val="0F1115"/>
+          <w:kern w:val="0"/>
+          <w:sz w:val="20"/>
+          <w:szCs w:val="20"/>
+          <w:lang w:eastAsia="en-GB"/>
+          <w14:ligatures w14:val="none"/>
+        </w:rPr>
+      </w:pPr>
+      <w:proofErr w:type="spellStart"/>
+      <w:r>
+        <w:rPr>
+          <w:rFonts w:ascii="Menlo" w:eastAsia="Times New Roman" w:hAnsi="Menlo" w:cs="Menlo"/>
+          <w:color w:val="4078F2"/>
+          <w:kern w:val="0"/>
+          <w:sz w:val="20"/>
+          <w:szCs w:val="20"/>
+          <w:lang w:eastAsia="en-GB"/>
+          <w14:ligatures w14:val="none"/>
+        </w:rPr>
+        <w:t>chmod</w:t>
+      </w:r>
+      <w:proofErr w:type="spellEnd"/>
+      <w:r>
+        <w:rPr>
+          <w:rFonts w:ascii="Menlo" w:eastAsia="Times New Roman" w:hAnsi="Menlo" w:cs="Menlo"/>
+          <w:color w:val="0F1115"/>
+          <w:kern w:val="0"/>
+          <w:sz w:val="20"/>
+          <w:szCs w:val="20"/>
+          <w:lang w:eastAsia="en-GB"/>
+          <w14:ligatures w14:val="none"/>
+        </w:rPr>
+        <w:t xml:space="preserve"> </w:t>
+      </w:r>
+      <w:r>
+        <w:rPr>
+          <w:rFonts w:ascii="Menlo" w:eastAsia="Times New Roman" w:hAnsi="Menlo" w:cs="Menlo"/>
+          <w:color w:val="B76B01"/>
+          <w:kern w:val="0"/>
+          <w:sz w:val="20"/>
+          <w:szCs w:val="20"/>
+          <w:lang w:eastAsia="en-GB"/>
+          <w14:ligatures w14:val="none"/>
+        </w:rPr>
+        <w:t>755</w:t>
+      </w:r>
+      <w:r>
+        <w:rPr>
+          <w:rFonts w:ascii="Menlo" w:eastAsia="Times New Roman" w:hAnsi="Menlo" w:cs="Menlo"/>
+          <w:color w:val="0F1115"/>
+          <w:kern w:val="0"/>
+          <w:sz w:val="20"/>
+          <w:szCs w:val="20"/>
+          <w:lang w:eastAsia="en-GB"/>
+          <w14:ligatures w14:val="none"/>
+        </w:rPr>
+        <w:t xml:space="preserve"> /Users/davidmiles/Desktop/AI-Evolution-System/services/*.py</w:t>
+      </w:r>
+    </w:p>
     <w:p/>
+    <w:p/>
+    <w:p/>
+    <w:p>
+      <w:pPr>
+        <w:pStyle w:val="Heading2"/>
+        <w:shd w:val="clear" w:color="auto" w:fill="FFFFFF"/>
+        <w:spacing w:before="480" w:after="240" w:line="480" w:lineRule="atLeast"/>
+        <w:rPr>
+          <w:rFonts w:ascii="Segoe UI" w:hAnsi="Segoe UI" w:cs="Segoe UI"/>
+          <w:color w:val="0F1115"/>
+          <w:sz w:val="33"/>
+          <w:szCs w:val="33"/>
+        </w:rPr>
+      </w:pPr>
+      <w:r>
+        <w:rPr>
+          <w:rFonts w:ascii="Apple Color Emoji" w:hAnsi="Apple Color Emoji" w:cs="Apple Color Emoji"/>
+          <w:color w:val="0F1115"/>
+          <w:sz w:val="33"/>
+          <w:szCs w:val="33"/>
+        </w:rPr>
+        <w:lastRenderedPageBreak/>
+        <w:t>📝</w:t>
+      </w:r>
+      <w:r>
+        <w:rPr>
+          <w:rFonts w:ascii="Segoe UI" w:hAnsi="Segoe UI" w:cs="Segoe UI"/>
+          <w:color w:val="0F1115"/>
+          <w:sz w:val="33"/>
+          <w:szCs w:val="33"/>
+        </w:rPr>
+        <w:t> </w:t>
+      </w:r>
+      <w:r>
+        <w:rPr>
+          <w:rStyle w:val="Strong"/>
+          <w:rFonts w:ascii="Segoe UI" w:hAnsi="Segoe UI" w:cs="Segoe UI"/>
+          <w:b w:val="0"/>
+          <w:bCs w:val="0"/>
+          <w:color w:val="0F1115"/>
+          <w:sz w:val="33"/>
+          <w:szCs w:val="33"/>
+        </w:rPr>
+        <w:t>Quick Reference Commands:</w:t>
+      </w:r>
+    </w:p>
+    <w:p>
+      <w:pPr>
+        <w:shd w:val="clear" w:color="auto" w:fill="FFFFFF"/>
+        <w:spacing w:line="189" w:lineRule="atLeast"/>
+        <w:rPr>
+          <w:rFonts w:ascii="Segoe UI" w:hAnsi="Segoe UI" w:cs="Segoe UI"/>
+          <w:color w:val="0F1115"/>
+          <w:sz w:val="19"/>
+          <w:szCs w:val="19"/>
+        </w:rPr>
+      </w:pPr>
+      <w:r>
+        <w:rPr>
+          <w:rStyle w:val="d813de27"/>
+          <w:rFonts w:ascii="Menlo" w:hAnsi="Menlo" w:cs="Menlo"/>
+          <w:color w:val="0F1115"/>
+          <w:sz w:val="18"/>
+          <w:szCs w:val="18"/>
+        </w:rPr>
+        <w:t>bash</w:t>
+      </w:r>
+    </w:p>
+    <w:p>
+      <w:pPr>
+        <w:pStyle w:val="HTMLPreformatted"/>
+        <w:wordWrap w:val="0"/>
+        <w:spacing w:line="330" w:lineRule="atLeast"/>
+        <w:rPr>
+          <w:rFonts w:ascii="Menlo" w:hAnsi="Menlo" w:cs="Menlo"/>
+          <w:color w:val="0F1115"/>
+        </w:rPr>
+      </w:pPr>
+      <w:r>
+        <w:rPr>
+          <w:rStyle w:val="token"/>
+          <w:rFonts w:ascii="Menlo" w:eastAsiaTheme="majorEastAsia" w:hAnsi="Menlo" w:cs="Menlo"/>
+          <w:i/>
+          <w:iCs/>
+          <w:color w:val="A0A1A7"/>
+        </w:rPr>
+        <w:t># Check health anytime</w:t>
+      </w:r>
+    </w:p>
+    <w:p>
+      <w:pPr>
+        <w:pStyle w:val="HTMLPreformatted"/>
+        <w:wordWrap w:val="0"/>
+        <w:spacing w:line="330" w:lineRule="atLeast"/>
+        <w:rPr>
+          <w:rFonts w:ascii="Menlo" w:hAnsi="Menlo" w:cs="Menlo"/>
+          <w:color w:val="0F1115"/>
+        </w:rPr>
+      </w:pPr>
+      <w:r>
+        <w:rPr>
+          <w:rFonts w:ascii="Menlo" w:hAnsi="Menlo" w:cs="Menlo"/>
+          <w:color w:val="0F1115"/>
+        </w:rPr>
+        <w:t>/Users/davidmiles/Desktop/AI-Evolution-System/check_dmai.sh</w:t>
+      </w:r>
+    </w:p>
+    <w:p>
+      <w:pPr>
+        <w:pStyle w:val="HTMLPreformatted"/>
+        <w:wordWrap w:val="0"/>
+        <w:spacing w:line="330" w:lineRule="atLeast"/>
+        <w:rPr>
+          <w:rFonts w:ascii="Menlo" w:hAnsi="Menlo" w:cs="Menlo"/>
+          <w:color w:val="0F1115"/>
+        </w:rPr>
+      </w:pPr>
+    </w:p>
+    <w:p>
+      <w:pPr>
+        <w:pStyle w:val="HTMLPreformatted"/>
+        <w:wordWrap w:val="0"/>
+        <w:spacing w:line="330" w:lineRule="atLeast"/>
+        <w:rPr>
+          <w:rFonts w:ascii="Menlo" w:hAnsi="Menlo" w:cs="Menlo"/>
+          <w:color w:val="0F1115"/>
+        </w:rPr>
+      </w:pPr>
+      <w:r>
+        <w:rPr>
+          <w:rStyle w:val="token"/>
+          <w:rFonts w:ascii="Menlo" w:eastAsiaTheme="majorEastAsia" w:hAnsi="Menlo" w:cs="Menlo"/>
+          <w:i/>
+          <w:iCs/>
+          <w:color w:val="A0A1A7"/>
+        </w:rPr>
+        <w:t xml:space="preserve"># Watch web researcher </w:t>
+      </w:r>
+      <w:proofErr w:type="gramStart"/>
+      <w:r>
+        <w:rPr>
+          <w:rStyle w:val="token"/>
+          <w:rFonts w:ascii="Menlo" w:eastAsiaTheme="majorEastAsia" w:hAnsi="Menlo" w:cs="Menlo"/>
+          <w:i/>
+          <w:iCs/>
+          <w:color w:val="A0A1A7"/>
+        </w:rPr>
+        <w:t>learn</w:t>
+      </w:r>
+      <w:proofErr w:type="gramEnd"/>
+    </w:p>
+    <w:p>
+      <w:pPr>
+        <w:pStyle w:val="HTMLPreformatted"/>
+        <w:wordWrap w:val="0"/>
+        <w:spacing w:line="330" w:lineRule="atLeast"/>
+        <w:rPr>
+          <w:rFonts w:ascii="Menlo" w:hAnsi="Menlo" w:cs="Menlo"/>
+          <w:color w:val="0F1115"/>
+        </w:rPr>
+      </w:pPr>
+      <w:r>
+        <w:rPr>
+          <w:rStyle w:val="token"/>
+          <w:rFonts w:ascii="Menlo" w:eastAsiaTheme="majorEastAsia" w:hAnsi="Menlo" w:cs="Menlo"/>
+          <w:color w:val="4078F2"/>
+        </w:rPr>
+        <w:t>tail</w:t>
+      </w:r>
+      <w:r>
+        <w:rPr>
+          <w:rFonts w:ascii="Menlo" w:hAnsi="Menlo" w:cs="Menlo"/>
+          <w:color w:val="0F1115"/>
+        </w:rPr>
+        <w:t xml:space="preserve"> </w:t>
+      </w:r>
+      <w:r>
+        <w:rPr>
+          <w:rStyle w:val="token"/>
+          <w:rFonts w:ascii="Menlo" w:eastAsiaTheme="majorEastAsia" w:hAnsi="Menlo" w:cs="Menlo"/>
+          <w:color w:val="4078F2"/>
+        </w:rPr>
+        <w:t>-f</w:t>
+      </w:r>
+      <w:r>
+        <w:rPr>
+          <w:rFonts w:ascii="Menlo" w:hAnsi="Menlo" w:cs="Menlo"/>
+          <w:color w:val="0F1115"/>
+        </w:rPr>
+        <w:t xml:space="preserve"> /Users/davidmiles/Desktop/AI-Evolution-System/logs/web_researcher.log</w:t>
+      </w:r>
+    </w:p>
+    <w:p>
+      <w:pPr>
+        <w:pStyle w:val="HTMLPreformatted"/>
+        <w:wordWrap w:val="0"/>
+        <w:spacing w:line="330" w:lineRule="atLeast"/>
+        <w:rPr>
+          <w:rFonts w:ascii="Menlo" w:hAnsi="Menlo" w:cs="Menlo"/>
+          <w:color w:val="0F1115"/>
+        </w:rPr>
+      </w:pPr>
+    </w:p>
+    <w:p>
+      <w:pPr>
+        <w:pStyle w:val="HTMLPreformatted"/>
+        <w:wordWrap w:val="0"/>
+        <w:spacing w:line="330" w:lineRule="atLeast"/>
+        <w:rPr>
+          <w:rFonts w:ascii="Menlo" w:hAnsi="Menlo" w:cs="Menlo"/>
+          <w:color w:val="0F1115"/>
+        </w:rPr>
+      </w:pPr>
+      <w:r>
+        <w:rPr>
+          <w:rStyle w:val="token"/>
+          <w:rFonts w:ascii="Menlo" w:eastAsiaTheme="majorEastAsia" w:hAnsi="Menlo" w:cs="Menlo"/>
+          <w:i/>
+          <w:iCs/>
+          <w:color w:val="A0A1A7"/>
+        </w:rPr>
+        <w:t># Check vocabulary growth</w:t>
+      </w:r>
+    </w:p>
+    <w:p>
+      <w:pPr>
+        <w:pStyle w:val="HTMLPreformatted"/>
+        <w:wordWrap w:val="0"/>
+        <w:spacing w:line="330" w:lineRule="atLeast"/>
+        <w:rPr>
+          <w:rFonts w:ascii="Menlo" w:hAnsi="Menlo" w:cs="Menlo"/>
+          <w:color w:val="0F1115"/>
+        </w:rPr>
+      </w:pPr>
+      <w:r>
+        <w:rPr>
+          <w:rFonts w:ascii="Menlo" w:hAnsi="Menlo" w:cs="Menlo"/>
+          <w:color w:val="0F1115"/>
+        </w:rPr>
+        <w:t xml:space="preserve">sqlite3 /Users/davidmiles/Desktop/AI-Evolution-System/language_learning/data/vocabulary.db </w:t>
+      </w:r>
+      <w:r>
+        <w:rPr>
+          <w:rStyle w:val="token"/>
+          <w:rFonts w:ascii="Menlo" w:eastAsiaTheme="majorEastAsia" w:hAnsi="Menlo" w:cs="Menlo"/>
+          <w:color w:val="50A14F"/>
+        </w:rPr>
+        <w:t xml:space="preserve">"SELECT </w:t>
+      </w:r>
+      <w:proofErr w:type="gramStart"/>
+      <w:r>
+        <w:rPr>
+          <w:rStyle w:val="token"/>
+          <w:rFonts w:ascii="Menlo" w:eastAsiaTheme="majorEastAsia" w:hAnsi="Menlo" w:cs="Menlo"/>
+          <w:color w:val="50A14F"/>
+        </w:rPr>
+        <w:t>COUNT(</w:t>
+      </w:r>
+      <w:proofErr w:type="gramEnd"/>
+      <w:r>
+        <w:rPr>
+          <w:rStyle w:val="token"/>
+          <w:rFonts w:ascii="Menlo" w:eastAsiaTheme="majorEastAsia" w:hAnsi="Menlo" w:cs="Menlo"/>
+          <w:color w:val="50A14F"/>
+        </w:rPr>
+        <w:t>*) FROM words;"</w:t>
+      </w:r>
+      <w:r>
+        <w:rPr>
+          <w:rFonts w:ascii="Menlo" w:hAnsi="Menlo" w:cs="Menlo"/>
+          <w:color w:val="0F1115"/>
+        </w:rPr>
+        <w:t xml:space="preserve"> </w:t>
+      </w:r>
+      <w:r>
+        <w:rPr>
+          <w:rStyle w:val="token"/>
+          <w:rFonts w:ascii="Menlo" w:eastAsiaTheme="majorEastAsia" w:hAnsi="Menlo" w:cs="Menlo"/>
+          <w:color w:val="E45649"/>
+        </w:rPr>
+        <w:t>2</w:t>
+      </w:r>
+      <w:r>
+        <w:rPr>
+          <w:rStyle w:val="token"/>
+          <w:rFonts w:ascii="Menlo" w:eastAsiaTheme="majorEastAsia" w:hAnsi="Menlo" w:cs="Menlo"/>
+          <w:color w:val="4078F2"/>
+        </w:rPr>
+        <w:t>&gt;</w:t>
+      </w:r>
+      <w:r>
+        <w:rPr>
+          <w:rFonts w:ascii="Menlo" w:hAnsi="Menlo" w:cs="Menlo"/>
+          <w:color w:val="0F1115"/>
+        </w:rPr>
+        <w:t>/dev/null</w:t>
+      </w:r>
+    </w:p>
+    <w:p>
+      <w:pPr>
+        <w:pStyle w:val="HTMLPreformatted"/>
+        <w:wordWrap w:val="0"/>
+        <w:spacing w:line="330" w:lineRule="atLeast"/>
+        <w:rPr>
+          <w:rFonts w:ascii="Menlo" w:hAnsi="Menlo" w:cs="Menlo"/>
+          <w:color w:val="0F1115"/>
+        </w:rPr>
+      </w:pPr>
+    </w:p>
+    <w:p>
+      <w:pPr>
+        <w:pStyle w:val="HTMLPreformatted"/>
+        <w:wordWrap w:val="0"/>
+        <w:spacing w:line="330" w:lineRule="atLeast"/>
+        <w:rPr>
+          <w:rFonts w:ascii="Menlo" w:hAnsi="Menlo" w:cs="Menlo"/>
+          <w:color w:val="0F1115"/>
+        </w:rPr>
+      </w:pPr>
+      <w:r>
+        <w:rPr>
+          <w:rStyle w:val="token"/>
+          <w:rFonts w:ascii="Menlo" w:eastAsiaTheme="majorEastAsia" w:hAnsi="Menlo" w:cs="Menlo"/>
+          <w:i/>
+          <w:iCs/>
+          <w:color w:val="A0A1A7"/>
+        </w:rPr>
+        <w:t># See what topics have been researched</w:t>
+      </w:r>
+    </w:p>
+    <w:p>
+      <w:pPr>
+        <w:pStyle w:val="HTMLPreformatted"/>
+        <w:wordWrap w:val="0"/>
+        <w:spacing w:line="330" w:lineRule="atLeast"/>
+        <w:rPr>
+          <w:rFonts w:ascii="Menlo" w:hAnsi="Menlo" w:cs="Menlo"/>
+          <w:color w:val="0F1115"/>
+        </w:rPr>
+      </w:pPr>
+      <w:r>
+        <w:rPr>
+          <w:rFonts w:ascii="Menlo" w:hAnsi="Menlo" w:cs="Menlo"/>
+          <w:color w:val="0F1115"/>
+        </w:rPr>
+        <w:t xml:space="preserve">sqlite3 /Users/davidmiles/Desktop/AI-Evolution-System/data/databases/dmai_research.db </w:t>
+      </w:r>
+      <w:r>
+        <w:rPr>
+          <w:rStyle w:val="token"/>
+          <w:rFonts w:ascii="Menlo" w:eastAsiaTheme="majorEastAsia" w:hAnsi="Menlo" w:cs="Menlo"/>
+          <w:color w:val="50A14F"/>
+        </w:rPr>
+        <w:t xml:space="preserve">"SELECT topic, </w:t>
+      </w:r>
+      <w:proofErr w:type="spellStart"/>
+      <w:r>
+        <w:rPr>
+          <w:rStyle w:val="token"/>
+          <w:rFonts w:ascii="Menlo" w:eastAsiaTheme="majorEastAsia" w:hAnsi="Menlo" w:cs="Menlo"/>
+          <w:color w:val="50A14F"/>
+        </w:rPr>
+        <w:t>research_count</w:t>
+      </w:r>
+      <w:proofErr w:type="spellEnd"/>
+      <w:r>
+        <w:rPr>
+          <w:rStyle w:val="token"/>
+          <w:rFonts w:ascii="Menlo" w:eastAsiaTheme="majorEastAsia" w:hAnsi="Menlo" w:cs="Menlo"/>
+          <w:color w:val="50A14F"/>
+        </w:rPr>
+        <w:t xml:space="preserve"> FROM topics WHERE </w:t>
+      </w:r>
+      <w:proofErr w:type="spellStart"/>
+      <w:r>
+        <w:rPr>
+          <w:rStyle w:val="token"/>
+          <w:rFonts w:ascii="Menlo" w:eastAsiaTheme="majorEastAsia" w:hAnsi="Menlo" w:cs="Menlo"/>
+          <w:color w:val="50A14F"/>
+        </w:rPr>
+        <w:t>research_count</w:t>
+      </w:r>
+      <w:proofErr w:type="spellEnd"/>
+      <w:r>
+        <w:rPr>
+          <w:rStyle w:val="token"/>
+          <w:rFonts w:ascii="Menlo" w:eastAsiaTheme="majorEastAsia" w:hAnsi="Menlo" w:cs="Menlo"/>
+          <w:color w:val="50A14F"/>
+        </w:rPr>
+        <w:t xml:space="preserve"> &gt; 0 ORDER BY </w:t>
+      </w:r>
+      <w:proofErr w:type="spellStart"/>
+      <w:r>
+        <w:rPr>
+          <w:rStyle w:val="token"/>
+          <w:rFonts w:ascii="Menlo" w:eastAsiaTheme="majorEastAsia" w:hAnsi="Menlo" w:cs="Menlo"/>
+          <w:color w:val="50A14F"/>
+        </w:rPr>
+        <w:t>research_count</w:t>
+      </w:r>
+      <w:proofErr w:type="spellEnd"/>
+      <w:r>
+        <w:rPr>
+          <w:rStyle w:val="token"/>
+          <w:rFonts w:ascii="Menlo" w:eastAsiaTheme="majorEastAsia" w:hAnsi="Menlo" w:cs="Menlo"/>
+          <w:color w:val="50A14F"/>
+        </w:rPr>
+        <w:t xml:space="preserve"> DESC;"</w:t>
+      </w:r>
+    </w:p>
+    <w:p>
+      <w:pPr>
+        <w:pStyle w:val="HTMLPreformatted"/>
+        <w:wordWrap w:val="0"/>
+        <w:spacing w:line="330" w:lineRule="atLeast"/>
+        <w:rPr>
+          <w:rFonts w:ascii="Menlo" w:hAnsi="Menlo" w:cs="Menlo"/>
+          <w:color w:val="0F1115"/>
+        </w:rPr>
+      </w:pPr>
+    </w:p>
+    <w:p>
+      <w:pPr>
+        <w:pStyle w:val="HTMLPreformatted"/>
+        <w:wordWrap w:val="0"/>
+        <w:spacing w:line="330" w:lineRule="atLeast"/>
+        <w:rPr>
+          <w:rFonts w:ascii="Menlo" w:hAnsi="Menlo" w:cs="Menlo"/>
+          <w:color w:val="0F1115"/>
+        </w:rPr>
+      </w:pPr>
+      <w:r>
+        <w:rPr>
+          <w:rStyle w:val="token"/>
+          <w:rFonts w:ascii="Menlo" w:eastAsiaTheme="majorEastAsia" w:hAnsi="Menlo" w:cs="Menlo"/>
+          <w:i/>
+          <w:iCs/>
+          <w:color w:val="A0A1A7"/>
+        </w:rPr>
+        <w:t># Monitor all DMAI processes</w:t>
+      </w:r>
+    </w:p>
+    <w:p>
+      <w:pPr>
+        <w:pStyle w:val="HTMLPreformatted"/>
+        <w:wordWrap w:val="0"/>
+        <w:spacing w:line="330" w:lineRule="atLeast"/>
+        <w:rPr>
+          <w:rFonts w:ascii="Menlo" w:hAnsi="Menlo" w:cs="Menlo"/>
+          <w:color w:val="0F1115"/>
+        </w:rPr>
+      </w:pPr>
+      <w:r>
+        <w:rPr>
+          <w:rStyle w:val="token"/>
+          <w:rFonts w:ascii="Menlo" w:eastAsiaTheme="majorEastAsia" w:hAnsi="Menlo" w:cs="Menlo"/>
+          <w:color w:val="4078F2"/>
+        </w:rPr>
+        <w:t>watch</w:t>
+      </w:r>
+      <w:r>
+        <w:rPr>
+          <w:rFonts w:ascii="Menlo" w:hAnsi="Menlo" w:cs="Menlo"/>
+          <w:color w:val="0F1115"/>
+        </w:rPr>
+        <w:t xml:space="preserve"> </w:t>
+      </w:r>
+      <w:r>
+        <w:rPr>
+          <w:rStyle w:val="token"/>
+          <w:rFonts w:ascii="Menlo" w:eastAsiaTheme="majorEastAsia" w:hAnsi="Menlo" w:cs="Menlo"/>
+          <w:color w:val="4078F2"/>
+        </w:rPr>
+        <w:t>-n</w:t>
+      </w:r>
+      <w:r>
+        <w:rPr>
+          <w:rFonts w:ascii="Menlo" w:hAnsi="Menlo" w:cs="Menlo"/>
+          <w:color w:val="0F1115"/>
+        </w:rPr>
+        <w:t xml:space="preserve"> </w:t>
+      </w:r>
+      <w:r>
+        <w:rPr>
+          <w:rStyle w:val="token"/>
+          <w:rFonts w:ascii="Menlo" w:eastAsiaTheme="majorEastAsia" w:hAnsi="Menlo" w:cs="Menlo"/>
+          <w:color w:val="B76B01"/>
+        </w:rPr>
+        <w:t>60</w:t>
+      </w:r>
+      <w:r>
+        <w:rPr>
+          <w:rFonts w:ascii="Menlo" w:hAnsi="Menlo" w:cs="Menlo"/>
+          <w:color w:val="0F1115"/>
+        </w:rPr>
+        <w:t xml:space="preserve"> </w:t>
+      </w:r>
+      <w:r>
+        <w:rPr>
+          <w:rStyle w:val="token"/>
+          <w:rFonts w:ascii="Menlo" w:eastAsiaTheme="majorEastAsia" w:hAnsi="Menlo" w:cs="Menlo"/>
+          <w:color w:val="50A14F"/>
+        </w:rPr>
+        <w:t>'</w:t>
+      </w:r>
+      <w:proofErr w:type="spellStart"/>
+      <w:r>
+        <w:rPr>
+          <w:rStyle w:val="token"/>
+          <w:rFonts w:ascii="Menlo" w:eastAsiaTheme="majorEastAsia" w:hAnsi="Menlo" w:cs="Menlo"/>
+          <w:color w:val="50A14F"/>
+        </w:rPr>
+        <w:t>ps</w:t>
+      </w:r>
+      <w:proofErr w:type="spellEnd"/>
+      <w:r>
+        <w:rPr>
+          <w:rStyle w:val="token"/>
+          <w:rFonts w:ascii="Menlo" w:eastAsiaTheme="majorEastAsia" w:hAnsi="Menlo" w:cs="Menlo"/>
+          <w:color w:val="50A14F"/>
+        </w:rPr>
+        <w:t xml:space="preserve"> aux | grep -E "</w:t>
+      </w:r>
+      <w:proofErr w:type="spellStart"/>
+      <w:r>
+        <w:rPr>
+          <w:rStyle w:val="token"/>
+          <w:rFonts w:ascii="Menlo" w:eastAsiaTheme="majorEastAsia" w:hAnsi="Menlo" w:cs="Menlo"/>
+          <w:color w:val="50A14F"/>
+        </w:rPr>
+        <w:t>dmai_core|services</w:t>
+      </w:r>
+      <w:proofErr w:type="spellEnd"/>
+      <w:r>
+        <w:rPr>
+          <w:rStyle w:val="token"/>
+          <w:rFonts w:ascii="Menlo" w:eastAsiaTheme="majorEastAsia" w:hAnsi="Menlo" w:cs="Menlo"/>
+          <w:color w:val="50A14F"/>
+        </w:rPr>
+        <w:t xml:space="preserve">/|voice/" | grep -v grep | </w:t>
+      </w:r>
+      <w:proofErr w:type="spellStart"/>
+      <w:r>
+        <w:rPr>
+          <w:rStyle w:val="token"/>
+          <w:rFonts w:ascii="Menlo" w:eastAsiaTheme="majorEastAsia" w:hAnsi="Menlo" w:cs="Menlo"/>
+          <w:color w:val="50A14F"/>
+        </w:rPr>
+        <w:t>wc</w:t>
+      </w:r>
+      <w:proofErr w:type="spellEnd"/>
+      <w:r>
+        <w:rPr>
+          <w:rStyle w:val="token"/>
+          <w:rFonts w:ascii="Menlo" w:eastAsiaTheme="majorEastAsia" w:hAnsi="Menlo" w:cs="Menlo"/>
+          <w:color w:val="50A14F"/>
+        </w:rPr>
+        <w:t xml:space="preserve"> -l'</w:t>
+      </w:r>
+    </w:p>
+    <w:p/>
+    <w:p/>
+    <w:p>
+      <w:pPr>
+        <w:pStyle w:val="Heading2"/>
+        <w:shd w:val="clear" w:color="auto" w:fill="FFFFFF"/>
+        <w:spacing w:before="480" w:after="240" w:line="480" w:lineRule="atLeast"/>
+        <w:rPr>
+          <w:rFonts w:ascii="Segoe UI" w:hAnsi="Segoe UI" w:cs="Segoe UI"/>
+          <w:color w:val="0F1115"/>
+          <w:sz w:val="33"/>
+          <w:szCs w:val="33"/>
+        </w:rPr>
+      </w:pPr>
+      <w:r>
+        <w:rPr>
+          <w:rFonts w:ascii="Segoe UI" w:hAnsi="Segoe UI" w:cs="Segoe UI"/>
+          <w:color w:val="0F1115"/>
+          <w:sz w:val="33"/>
+          <w:szCs w:val="33"/>
+        </w:rPr>
+        <w:t> COMMANDS YOU CAN NOW USE:</w:t>
+      </w:r>
+    </w:p>
+    <w:p>
+      <w:pPr>
+        <w:shd w:val="clear" w:color="auto" w:fill="FFFFFF"/>
+        <w:spacing w:line="189" w:lineRule="atLeast"/>
+        <w:rPr>
+          <w:rFonts w:ascii="Segoe UI" w:hAnsi="Segoe UI" w:cs="Segoe UI"/>
+          <w:color w:val="0F1115"/>
+          <w:sz w:val="19"/>
+          <w:szCs w:val="19"/>
+        </w:rPr>
+      </w:pPr>
+      <w:r>
+        <w:rPr>
+          <w:rStyle w:val="d813de27"/>
+          <w:rFonts w:ascii="Menlo" w:hAnsi="Menlo" w:cs="Menlo"/>
+          <w:color w:val="0F1115"/>
+          <w:sz w:val="18"/>
+          <w:szCs w:val="18"/>
+        </w:rPr>
+        <w:t>bash</w:t>
+      </w:r>
+    </w:p>
+    <w:p>
+      <w:pPr>
+        <w:pStyle w:val="HTMLPreformatted"/>
+        <w:wordWrap w:val="0"/>
+        <w:spacing w:line="330" w:lineRule="atLeast"/>
+        <w:rPr>
+          <w:rFonts w:ascii="Menlo" w:hAnsi="Menlo" w:cs="Menlo"/>
+          <w:color w:val="0F1115"/>
+        </w:rPr>
+      </w:pPr>
+      <w:r>
+        <w:rPr>
+          <w:rStyle w:val="token"/>
+          <w:rFonts w:ascii="Menlo" w:eastAsiaTheme="majorEastAsia" w:hAnsi="Menlo" w:cs="Menlo"/>
+          <w:i/>
+          <w:iCs/>
+          <w:color w:val="A0A1A7"/>
+        </w:rPr>
+        <w:t># Check voice status anytime</w:t>
+      </w:r>
+    </w:p>
+    <w:p>
+      <w:pPr>
+        <w:pStyle w:val="HTMLPreformatted"/>
+        <w:wordWrap w:val="0"/>
+        <w:spacing w:line="330" w:lineRule="atLeast"/>
+        <w:rPr>
+          <w:rFonts w:ascii="Menlo" w:hAnsi="Menlo" w:cs="Menlo"/>
+          <w:color w:val="0F1115"/>
+        </w:rPr>
+      </w:pPr>
+      <w:r>
+        <w:rPr>
+          <w:rFonts w:ascii="Menlo" w:hAnsi="Menlo" w:cs="Menlo"/>
+          <w:color w:val="0F1115"/>
+        </w:rPr>
+        <w:t>/Users/davidmiles/Desktop/AI-Evolution-System/scripts/voice_status.sh</w:t>
+      </w:r>
+    </w:p>
+    <w:p>
+      <w:pPr>
+        <w:pStyle w:val="HTMLPreformatted"/>
+        <w:wordWrap w:val="0"/>
+        <w:spacing w:line="330" w:lineRule="atLeast"/>
+        <w:rPr>
+          <w:rFonts w:ascii="Menlo" w:hAnsi="Menlo" w:cs="Menlo"/>
+          <w:color w:val="0F1115"/>
+        </w:rPr>
+      </w:pPr>
+    </w:p>
+    <w:p>
+      <w:pPr>
+        <w:pStyle w:val="HTMLPreformatted"/>
+        <w:wordWrap w:val="0"/>
+        <w:spacing w:line="330" w:lineRule="atLeast"/>
+        <w:rPr>
+          <w:rFonts w:ascii="Menlo" w:hAnsi="Menlo" w:cs="Menlo"/>
+          <w:color w:val="0F1115"/>
+        </w:rPr>
+      </w:pPr>
+      <w:r>
+        <w:rPr>
+          <w:rStyle w:val="token"/>
+          <w:rFonts w:ascii="Menlo" w:eastAsiaTheme="majorEastAsia" w:hAnsi="Menlo" w:cs="Menlo"/>
+          <w:i/>
+          <w:iCs/>
+          <w:color w:val="A0A1A7"/>
+        </w:rPr>
+        <w:t># See vocabulary growth in real-time</w:t>
+      </w:r>
+    </w:p>
+    <w:p>
+      <w:pPr>
+        <w:pStyle w:val="HTMLPreformatted"/>
+        <w:wordWrap w:val="0"/>
+        <w:spacing w:line="330" w:lineRule="atLeast"/>
+        <w:rPr>
+          <w:rFonts w:ascii="Menlo" w:hAnsi="Menlo" w:cs="Menlo"/>
+          <w:color w:val="0F1115"/>
+        </w:rPr>
+      </w:pPr>
+      <w:r>
+        <w:rPr>
+          <w:rStyle w:val="token"/>
+          <w:rFonts w:ascii="Menlo" w:eastAsiaTheme="majorEastAsia" w:hAnsi="Menlo" w:cs="Menlo"/>
+          <w:color w:val="4078F2"/>
+        </w:rPr>
+        <w:t>tail</w:t>
+      </w:r>
+      <w:r>
+        <w:rPr>
+          <w:rFonts w:ascii="Menlo" w:hAnsi="Menlo" w:cs="Menlo"/>
+          <w:color w:val="0F1115"/>
+        </w:rPr>
+        <w:t xml:space="preserve"> </w:t>
+      </w:r>
+      <w:r>
+        <w:rPr>
+          <w:rStyle w:val="token"/>
+          <w:rFonts w:ascii="Menlo" w:eastAsiaTheme="majorEastAsia" w:hAnsi="Menlo" w:cs="Menlo"/>
+          <w:color w:val="4078F2"/>
+        </w:rPr>
+        <w:t>-f</w:t>
+      </w:r>
+      <w:r>
+        <w:rPr>
+          <w:rFonts w:ascii="Menlo" w:hAnsi="Menlo" w:cs="Menlo"/>
+          <w:color w:val="0F1115"/>
+        </w:rPr>
+        <w:t xml:space="preserve"> /Users/davidmiles/Desktop/AI-Evolution-System/logs/vocabulary_changes.log</w:t>
+      </w:r>
+    </w:p>
+    <w:p>
+      <w:pPr>
+        <w:pStyle w:val="HTMLPreformatted"/>
+        <w:wordWrap w:val="0"/>
+        <w:spacing w:line="330" w:lineRule="atLeast"/>
+        <w:rPr>
+          <w:rFonts w:ascii="Menlo" w:hAnsi="Menlo" w:cs="Menlo"/>
+          <w:color w:val="0F1115"/>
+        </w:rPr>
+      </w:pPr>
+    </w:p>
+    <w:p>
+      <w:pPr>
+        <w:pStyle w:val="HTMLPreformatted"/>
+        <w:wordWrap w:val="0"/>
+        <w:spacing w:line="330" w:lineRule="atLeast"/>
+        <w:rPr>
+          <w:rFonts w:ascii="Menlo" w:hAnsi="Menlo" w:cs="Menlo"/>
+          <w:color w:val="0F1115"/>
+        </w:rPr>
+      </w:pPr>
+      <w:r>
+        <w:rPr>
+          <w:rStyle w:val="token"/>
+          <w:rFonts w:ascii="Menlo" w:eastAsiaTheme="majorEastAsia" w:hAnsi="Menlo" w:cs="Menlo"/>
+          <w:i/>
+          <w:iCs/>
+          <w:color w:val="A0A1A7"/>
+        </w:rPr>
+        <w:t># View vocabulary statistics</w:t>
+      </w:r>
+    </w:p>
+    <w:p>
+      <w:pPr>
+        <w:pStyle w:val="HTMLPreformatted"/>
+        <w:wordWrap w:val="0"/>
+        <w:spacing w:line="330" w:lineRule="atLeast"/>
+        <w:rPr>
+          <w:rFonts w:ascii="Menlo" w:hAnsi="Menlo" w:cs="Menlo"/>
+          <w:color w:val="0F1115"/>
+        </w:rPr>
+      </w:pPr>
+      <w:r>
+        <w:rPr>
+          <w:rFonts w:ascii="Menlo" w:hAnsi="Menlo" w:cs="Menlo"/>
+          <w:color w:val="0F1115"/>
+        </w:rPr>
+        <w:t>/Users/davidmiles/Desktop/AI-Evolution-System/language_learning/data/secure/vocabulary_manager.py</w:t>
+      </w:r>
+    </w:p>
+    <w:p>
+      <w:pPr>
+        <w:pStyle w:val="HTMLPreformatted"/>
+        <w:wordWrap w:val="0"/>
+        <w:spacing w:line="330" w:lineRule="atLeast"/>
+        <w:rPr>
+          <w:rFonts w:ascii="Menlo" w:hAnsi="Menlo" w:cs="Menlo"/>
+          <w:color w:val="0F1115"/>
+        </w:rPr>
+      </w:pPr>
+    </w:p>
+    <w:p>
+      <w:pPr>
+        <w:pStyle w:val="HTMLPreformatted"/>
+        <w:wordWrap w:val="0"/>
+        <w:spacing w:line="330" w:lineRule="atLeast"/>
+        <w:rPr>
+          <w:rFonts w:ascii="Menlo" w:hAnsi="Menlo" w:cs="Menlo"/>
+          <w:color w:val="0F1115"/>
+        </w:rPr>
+      </w:pPr>
+      <w:r>
+        <w:rPr>
+          <w:rStyle w:val="token"/>
+          <w:rFonts w:ascii="Menlo" w:eastAsiaTheme="majorEastAsia" w:hAnsi="Menlo" w:cs="Menlo"/>
+          <w:i/>
+          <w:iCs/>
+          <w:color w:val="A0A1A7"/>
+        </w:rPr>
+        <w:t># List all backups</w:t>
+      </w:r>
+    </w:p>
+    <w:p>
+      <w:pPr>
+        <w:pStyle w:val="HTMLPreformatted"/>
+        <w:wordWrap w:val="0"/>
+        <w:spacing w:line="330" w:lineRule="atLeast"/>
+        <w:rPr>
+          <w:rFonts w:ascii="Menlo" w:hAnsi="Menlo" w:cs="Menlo"/>
+          <w:color w:val="0F1115"/>
+        </w:rPr>
+      </w:pPr>
+      <w:r>
+        <w:rPr>
+          <w:rStyle w:val="token"/>
+          <w:rFonts w:ascii="Menlo" w:eastAsiaTheme="majorEastAsia" w:hAnsi="Menlo" w:cs="Menlo"/>
+          <w:color w:val="4078F2"/>
+        </w:rPr>
+        <w:lastRenderedPageBreak/>
+        <w:t>ls</w:t>
+      </w:r>
+      <w:r>
+        <w:rPr>
+          <w:rFonts w:ascii="Menlo" w:hAnsi="Menlo" w:cs="Menlo"/>
+          <w:color w:val="0F1115"/>
+        </w:rPr>
+        <w:t xml:space="preserve"> </w:t>
+      </w:r>
+      <w:r>
+        <w:rPr>
+          <w:rStyle w:val="token"/>
+          <w:rFonts w:ascii="Menlo" w:eastAsiaTheme="majorEastAsia" w:hAnsi="Menlo" w:cs="Menlo"/>
+          <w:color w:val="4078F2"/>
+        </w:rPr>
+        <w:t>-la</w:t>
+      </w:r>
+      <w:r>
+        <w:rPr>
+          <w:rFonts w:ascii="Menlo" w:hAnsi="Menlo" w:cs="Menlo"/>
+          <w:color w:val="0F1115"/>
+        </w:rPr>
+        <w:t xml:space="preserve"> /Users/davidmiles/Desktop/AI-Evolution-System/language_learning/data/secure/backups/</w:t>
+      </w:r>
+    </w:p>
+    <w:p>
+      <w:pPr>
+        <w:pStyle w:val="HTMLPreformatted"/>
+        <w:wordWrap w:val="0"/>
+        <w:spacing w:line="330" w:lineRule="atLeast"/>
+        <w:rPr>
+          <w:rFonts w:ascii="Menlo" w:hAnsi="Menlo" w:cs="Menlo"/>
+          <w:color w:val="0F1115"/>
+        </w:rPr>
+      </w:pPr>
+      <w:r>
+        <w:br/>
+      </w:r>
+      <w:r>
+        <w:br/>
+      </w:r>
+      <w:r>
+        <w:rPr>
+          <w:rFonts w:ascii="Menlo" w:hAnsi="Menlo" w:cs="Menlo"/>
+          <w:color w:val="0F1115"/>
+        </w:rPr>
+        <w:br/>
+        <w:t xml:space="preserve">## </w:t>
+      </w:r>
+      <w:r>
+        <w:rPr>
+          <w:rFonts w:ascii="Apple Color Emoji" w:hAnsi="Apple Color Emoji" w:cs="Apple Color Emoji"/>
+          <w:color w:val="0F1115"/>
+        </w:rPr>
+        <w:t>📋</w:t>
+      </w:r>
+      <w:r>
+        <w:rPr>
+          <w:rFonts w:ascii="Menlo" w:hAnsi="Menlo" w:cs="Menlo"/>
+          <w:color w:val="0F1115"/>
+        </w:rPr>
+        <w:t xml:space="preserve"> HOW TO USE THIS DOCUMENT</w:t>
+      </w:r>
+    </w:p>
+    <w:p>
+      <w:pPr>
+        <w:pStyle w:val="HTMLPreformatted"/>
+        <w:wordWrap w:val="0"/>
+        <w:spacing w:line="330" w:lineRule="atLeast"/>
+        <w:rPr>
+          <w:rFonts w:ascii="Menlo" w:hAnsi="Menlo" w:cs="Menlo"/>
+          <w:color w:val="0F1115"/>
+        </w:rPr>
+      </w:pPr>
+    </w:p>
+    <w:p>
+      <w:pPr>
+        <w:pStyle w:val="HTMLPreformatted"/>
+        <w:wordWrap w:val="0"/>
+        <w:spacing w:line="330" w:lineRule="atLeast"/>
+        <w:rPr>
+          <w:rFonts w:ascii="Menlo" w:hAnsi="Menlo" w:cs="Menlo"/>
+          <w:color w:val="0F1115"/>
+        </w:rPr>
+      </w:pPr>
+      <w:r>
+        <w:rPr>
+          <w:rFonts w:ascii="Menlo" w:hAnsi="Menlo" w:cs="Menlo"/>
+          <w:color w:val="0F1115"/>
+        </w:rPr>
+        <w:t>### For You:</w:t>
+      </w:r>
+    </w:p>
+    <w:p>
+      <w:pPr>
+        <w:pStyle w:val="HTMLPreformatted"/>
+        <w:wordWrap w:val="0"/>
+        <w:spacing w:line="330" w:lineRule="atLeast"/>
+        <w:rPr>
+          <w:rFonts w:ascii="Menlo" w:hAnsi="Menlo" w:cs="Menlo"/>
+          <w:color w:val="0F1115"/>
+        </w:rPr>
+      </w:pPr>
+      <w:r>
+        <w:rPr>
+          <w:rFonts w:ascii="Menlo" w:hAnsi="Menlo" w:cs="Menlo"/>
+          <w:color w:val="0F1115"/>
+        </w:rPr>
+        <w:t>```bash</w:t>
+      </w:r>
+    </w:p>
+    <w:p>
+      <w:pPr>
+        <w:pStyle w:val="HTMLPreformatted"/>
+        <w:wordWrap w:val="0"/>
+        <w:spacing w:line="330" w:lineRule="atLeast"/>
+        <w:rPr>
+          <w:rFonts w:ascii="Menlo" w:hAnsi="Menlo" w:cs="Menlo"/>
+          <w:color w:val="0F1115"/>
+        </w:rPr>
+      </w:pPr>
+      <w:r>
+        <w:rPr>
+          <w:rFonts w:ascii="Menlo" w:hAnsi="Menlo" w:cs="Menlo"/>
+          <w:color w:val="0F1115"/>
+        </w:rPr>
+        <w:t># View the document anytime</w:t>
+      </w:r>
+    </w:p>
+    <w:p>
+      <w:pPr>
+        <w:pStyle w:val="HTMLPreformatted"/>
+        <w:wordWrap w:val="0"/>
+        <w:spacing w:line="330" w:lineRule="atLeast"/>
+        <w:rPr>
+          <w:rFonts w:ascii="Menlo" w:hAnsi="Menlo" w:cs="Menlo"/>
+          <w:color w:val="0F1115"/>
+        </w:rPr>
+      </w:pPr>
+      <w:r>
+        <w:rPr>
+          <w:rFonts w:ascii="Menlo" w:hAnsi="Menlo" w:cs="Menlo"/>
+          <w:color w:val="0F1115"/>
+        </w:rPr>
+        <w:t>cat /Users/davidmiles/Desktop/AI-Evolution-System/DMAI_MASTER_PLAN_20260306.md</w:t>
+      </w:r>
+    </w:p>
+    <w:p>
+      <w:pPr>
+        <w:pStyle w:val="HTMLPreformatted"/>
+        <w:wordWrap w:val="0"/>
+        <w:spacing w:line="330" w:lineRule="atLeast"/>
+        <w:rPr>
+          <w:rFonts w:ascii="Menlo" w:hAnsi="Menlo" w:cs="Menlo"/>
+          <w:color w:val="0F1115"/>
+        </w:rPr>
+      </w:pPr>
+    </w:p>
+    <w:p>
+      <w:pPr>
+        <w:pStyle w:val="HTMLPreformatted"/>
+        <w:wordWrap w:val="0"/>
+        <w:spacing w:line="330" w:lineRule="atLeast"/>
+        <w:rPr>
+          <w:rFonts w:ascii="Menlo" w:hAnsi="Menlo" w:cs="Menlo"/>
+          <w:color w:val="0F1115"/>
+        </w:rPr>
+      </w:pPr>
+      <w:r>
+        <w:rPr>
+          <w:rFonts w:ascii="Menlo" w:hAnsi="Menlo" w:cs="Menlo"/>
+          <w:color w:val="0F1115"/>
+        </w:rPr>
+        <w:t># Or open in your editor</w:t>
+      </w:r>
+    </w:p>
+    <w:p>
+      <w:pPr>
+        <w:pStyle w:val="HTMLPreformatted"/>
+        <w:wordWrap w:val="0"/>
+        <w:spacing w:line="330" w:lineRule="atLeast"/>
+        <w:rPr>
+          <w:rFonts w:ascii="Menlo" w:hAnsi="Menlo" w:cs="Menlo"/>
+          <w:color w:val="0F1115"/>
+        </w:rPr>
+      </w:pPr>
+      <w:r>
+        <w:rPr>
+          <w:rFonts w:ascii="Menlo" w:hAnsi="Menlo" w:cs="Menlo"/>
+          <w:color w:val="0F1115"/>
+        </w:rPr>
+        <w:t>open /Users/davidmiles/Desktop/AI-Evolution-System/DMAI_MASTER_PLAN_20260306.md</w:t>
+      </w:r>
+    </w:p>
+    <w:p>
+      <w:pPr>
+        <w:pStyle w:val="Heading3"/>
+        <w:spacing w:before="480" w:after="240" w:line="450" w:lineRule="atLeast"/>
+        <w:rPr>
+          <w:rFonts w:ascii="Segoe UI" w:hAnsi="Segoe UI" w:cs="Segoe UI"/>
+          <w:color w:val="0F1115"/>
+          <w:sz w:val="30"/>
+          <w:szCs w:val="30"/>
+        </w:rPr>
+      </w:pPr>
+      <w:r>
+        <w:rPr>
+          <w:rFonts w:ascii="Segoe UI" w:hAnsi="Segoe UI" w:cs="Segoe UI"/>
+          <w:color w:val="0F1115"/>
+          <w:sz w:val="30"/>
+          <w:szCs w:val="30"/>
+        </w:rPr>
+        <w:t>For Me (The AI):</w:t>
+      </w:r>
+    </w:p>
+    <w:p>
+      <w:pPr>
+        <w:pStyle w:val="ds-markdown-paragraph"/>
+        <w:spacing w:before="240" w:beforeAutospacing="0" w:after="240" w:afterAutospacing="0" w:line="420" w:lineRule="atLeast"/>
+        <w:rPr>
+          <w:rFonts w:ascii="Segoe UI" w:hAnsi="Segoe UI" w:cs="Segoe UI"/>
+          <w:color w:val="0F1115"/>
+        </w:rPr>
+      </w:pPr>
+      <w:r>
+        <w:rPr>
+          <w:rFonts w:ascii="Segoe UI" w:hAnsi="Segoe UI" w:cs="Segoe UI"/>
+          <w:color w:val="0F1115"/>
+        </w:rPr>
+        <w:t>When you want to continue work, simply say:</w:t>
+      </w:r>
+    </w:p>
+    <w:p>
+      <w:pPr>
+        <w:pStyle w:val="ds-markdown-paragraph"/>
+        <w:spacing w:before="0" w:beforeAutospacing="0" w:after="0" w:afterAutospacing="0" w:line="420" w:lineRule="atLeast"/>
+        <w:rPr>
+          <w:rFonts w:ascii="Segoe UI" w:hAnsi="Segoe UI" w:cs="Segoe UI"/>
+          <w:color w:val="0F1115"/>
+        </w:rPr>
+      </w:pPr>
+      <w:r>
+        <w:rPr>
+          <w:rFonts w:ascii="Segoe UI" w:hAnsi="Segoe UI" w:cs="Segoe UI"/>
+          <w:color w:val="0F1115"/>
+        </w:rPr>
+        <w:t>"Continue from the master plan. Let's work on [specific phase/task]."</w:t>
+      </w:r>
+    </w:p>
+    <w:p>
+      <w:pPr>
+        <w:pStyle w:val="ds-markdown-paragraph"/>
+        <w:spacing w:before="240" w:beforeAutospacing="0" w:after="240" w:afterAutospacing="0" w:line="420" w:lineRule="atLeast"/>
+        <w:rPr>
+          <w:rFonts w:ascii="Segoe UI" w:hAnsi="Segoe UI" w:cs="Segoe UI"/>
+          <w:color w:val="0F1115"/>
+        </w:rPr>
+      </w:pPr>
+      <w:r>
+        <w:rPr>
+          <w:rFonts w:ascii="Segoe UI" w:hAnsi="Segoe UI" w:cs="Segoe UI"/>
+          <w:color w:val="0F1115"/>
+        </w:rPr>
+        <w:t>I will:</w:t>
+      </w:r>
+    </w:p>
+    <w:p>
+      <w:pPr>
+        <w:pStyle w:val="ds-markdown-paragraph"/>
+        <w:numPr>
+          <w:ilvl w:val="0"/>
+          <w:numId w:val="1"/>
+        </w:numPr>
+        <w:spacing w:before="0" w:beforeAutospacing="0" w:after="0" w:afterAutospacing="0" w:line="420" w:lineRule="atLeast"/>
+        <w:rPr>
+          <w:rFonts w:ascii="Segoe UI" w:hAnsi="Segoe UI" w:cs="Segoe UI"/>
+          <w:color w:val="0F1115"/>
+        </w:rPr>
+      </w:pPr>
+      <w:r>
+        <w:rPr>
+          <w:rFonts w:ascii="Segoe UI" w:hAnsi="Segoe UI" w:cs="Segoe UI"/>
+          <w:color w:val="0F1115"/>
+        </w:rPr>
+        <w:t xml:space="preserve">Reference this document for </w:t>
+      </w:r>
+      <w:proofErr w:type="gramStart"/>
+      <w:r>
+        <w:rPr>
+          <w:rFonts w:ascii="Segoe UI" w:hAnsi="Segoe UI" w:cs="Segoe UI"/>
+          <w:color w:val="0F1115"/>
+        </w:rPr>
+        <w:t>current status</w:t>
+      </w:r>
+      <w:proofErr w:type="gramEnd"/>
+    </w:p>
+    <w:p>
+      <w:pPr>
+        <w:pStyle w:val="ds-markdown-paragraph"/>
+        <w:numPr>
+          <w:ilvl w:val="0"/>
+          <w:numId w:val="1"/>
+        </w:numPr>
+        <w:spacing w:before="0" w:beforeAutospacing="0" w:after="0" w:afterAutospacing="0" w:line="420" w:lineRule="atLeast"/>
+        <w:rPr>
+          <w:rFonts w:ascii="Segoe UI" w:hAnsi="Segoe UI" w:cs="Segoe UI"/>
+          <w:color w:val="0F1115"/>
+        </w:rPr>
+      </w:pPr>
+      <w:r>
+        <w:rPr>
+          <w:rFonts w:ascii="Segoe UI" w:hAnsi="Segoe UI" w:cs="Segoe UI"/>
+          <w:color w:val="0F1115"/>
+        </w:rPr>
+        <w:t>Know exactly what's been completed</w:t>
+      </w:r>
+    </w:p>
+    <w:p>
+      <w:pPr>
+        <w:pStyle w:val="ds-markdown-paragraph"/>
+        <w:numPr>
+          <w:ilvl w:val="0"/>
+          <w:numId w:val="1"/>
+        </w:numPr>
+        <w:spacing w:before="0" w:beforeAutospacing="0" w:after="0" w:afterAutospacing="0" w:line="420" w:lineRule="atLeast"/>
+        <w:rPr>
+          <w:rFonts w:ascii="Segoe UI" w:hAnsi="Segoe UI" w:cs="Segoe UI"/>
+          <w:color w:val="0F1115"/>
+        </w:rPr>
+      </w:pPr>
+      <w:r>
+        <w:rPr>
+          <w:rFonts w:ascii="Segoe UI" w:hAnsi="Segoe UI" w:cs="Segoe UI"/>
+          <w:color w:val="0F1115"/>
+        </w:rPr>
+        <w:t>Provide the next commands in sequence</w:t>
+      </w:r>
+    </w:p>
+    <w:p>
+      <w:pPr>
+        <w:pStyle w:val="ds-markdown-paragraph"/>
+        <w:numPr>
+          <w:ilvl w:val="0"/>
+          <w:numId w:val="1"/>
+        </w:numPr>
+        <w:spacing w:before="0" w:beforeAutospacing="0" w:after="0" w:afterAutospacing="0" w:line="420" w:lineRule="atLeast"/>
+        <w:rPr>
+          <w:rFonts w:ascii="Segoe UI" w:hAnsi="Segoe UI" w:cs="Segoe UI"/>
+          <w:color w:val="0F1115"/>
+        </w:rPr>
+      </w:pPr>
+      <w:r>
+        <w:rPr>
+          <w:rFonts w:ascii="Segoe UI" w:hAnsi="Segoe UI" w:cs="Segoe UI"/>
+          <w:color w:val="0F1115"/>
+        </w:rPr>
+        <w:t>Update the plan as we progress</w:t>
+      </w:r>
+    </w:p>
+    <w:p>
+      <w:pPr>
+        <w:pStyle w:val="Heading3"/>
+        <w:spacing w:before="480" w:after="240" w:line="450" w:lineRule="atLeast"/>
+        <w:rPr>
+          <w:rFonts w:ascii="Segoe UI" w:hAnsi="Segoe UI" w:cs="Segoe UI"/>
+          <w:color w:val="0F1115"/>
+          <w:sz w:val="30"/>
+          <w:szCs w:val="30"/>
+        </w:rPr>
+      </w:pPr>
+      <w:r>
+        <w:rPr>
+          <w:rFonts w:ascii="Segoe UI" w:hAnsi="Segoe UI" w:cs="Segoe UI"/>
+          <w:color w:val="0F1115"/>
+          <w:sz w:val="30"/>
+          <w:szCs w:val="30"/>
+        </w:rPr>
+        <w:t>To Update Progress:</w:t>
+      </w:r>
+    </w:p>
+    <w:p>
+      <w:pPr>
+        <w:pStyle w:val="ds-markdown-paragraph"/>
+        <w:spacing w:before="240" w:beforeAutospacing="0" w:after="240" w:afterAutospacing="0" w:line="420" w:lineRule="atLeast"/>
+        <w:rPr>
+          <w:rFonts w:ascii="Segoe UI" w:hAnsi="Segoe UI" w:cs="Segoe UI"/>
+          <w:color w:val="0F1115"/>
+        </w:rPr>
+      </w:pPr>
+      <w:r>
+        <w:rPr>
+          <w:rFonts w:ascii="Segoe UI" w:hAnsi="Segoe UI" w:cs="Segoe UI"/>
+          <w:color w:val="0F1115"/>
+        </w:rPr>
+        <w:t>After completing tasks, I'll provide updated commands to keep the master plan current:</w:t>
+      </w:r>
+    </w:p>
+    <w:p>
+      <w:pPr>
+        <w:shd w:val="clear" w:color="auto" w:fill="FFFFFF"/>
+        <w:spacing w:line="189" w:lineRule="atLeast"/>
+        <w:rPr>
+          <w:rFonts w:ascii="Segoe UI" w:hAnsi="Segoe UI" w:cs="Segoe UI"/>
+          <w:color w:val="0F1115"/>
+          <w:sz w:val="19"/>
+          <w:szCs w:val="19"/>
+        </w:rPr>
+      </w:pPr>
+      <w:r>
+        <w:rPr>
+          <w:rStyle w:val="d813de27"/>
+          <w:rFonts w:ascii="Menlo" w:hAnsi="Menlo" w:cs="Menlo"/>
+          <w:color w:val="0F1115"/>
+          <w:sz w:val="18"/>
+          <w:szCs w:val="18"/>
+        </w:rPr>
+        <w:t>bash</w:t>
+      </w:r>
+    </w:p>
+    <w:p>
+      <w:pPr>
+        <w:pStyle w:val="HTMLPreformatted"/>
+        <w:wordWrap w:val="0"/>
+        <w:spacing w:line="330" w:lineRule="atLeast"/>
+        <w:rPr>
+          <w:rFonts w:ascii="Menlo" w:hAnsi="Menlo" w:cs="Menlo"/>
+          <w:color w:val="0F1115"/>
+        </w:rPr>
+      </w:pPr>
+      <w:r>
+        <w:rPr>
+          <w:rStyle w:val="token"/>
+          <w:rFonts w:ascii="Menlo" w:eastAsiaTheme="majorEastAsia" w:hAnsi="Menlo" w:cs="Menlo"/>
+          <w:i/>
+          <w:iCs/>
+          <w:color w:val="A0A1A7"/>
+        </w:rPr>
+        <w:t># Update the plan with new completion status</w:t>
+      </w:r>
+    </w:p>
+    <w:p>
+      <w:pPr>
+        <w:pStyle w:val="HTMLPreformatted"/>
+        <w:wordWrap w:val="0"/>
+        <w:spacing w:line="330" w:lineRule="atLeast"/>
+        <w:rPr>
+          <w:rFonts w:ascii="Menlo" w:hAnsi="Menlo" w:cs="Menlo"/>
+          <w:color w:val="0F1115"/>
+        </w:rPr>
+      </w:pPr>
+      <w:r>
+        <w:rPr>
+          <w:rStyle w:val="token"/>
+          <w:rFonts w:ascii="Menlo" w:eastAsiaTheme="majorEastAsia" w:hAnsi="Menlo" w:cs="Menlo"/>
+          <w:i/>
+          <w:iCs/>
+          <w:color w:val="A0A1A7"/>
+        </w:rPr>
+        <w:t># (I'll provide this command after each session)</w:t>
+      </w:r>
+    </w:p>
+    <w:p>
+      <w:pPr>
+        <w:pStyle w:val="ds-markdown-paragraph"/>
+        <w:spacing w:before="240" w:beforeAutospacing="0" w:after="0" w:afterAutospacing="0" w:line="420" w:lineRule="atLeast"/>
+        <w:rPr>
+          <w:rFonts w:ascii="Segoe UI" w:hAnsi="Segoe UI" w:cs="Segoe UI"/>
+          <w:color w:val="0F1115"/>
+        </w:rPr>
+      </w:pPr>
+      <w:r>
+        <w:rPr>
+          <w:rFonts w:ascii="Segoe UI" w:hAnsi="Segoe UI" w:cs="Segoe UI"/>
+          <w:color w:val="0F1115"/>
+        </w:rPr>
+        <w:lastRenderedPageBreak/>
+        <w:t>This creates a </w:t>
+      </w:r>
+      <w:r>
+        <w:rPr>
+          <w:rStyle w:val="Strong"/>
+          <w:rFonts w:ascii="Segoe UI" w:eastAsiaTheme="majorEastAsia" w:hAnsi="Segoe UI" w:cs="Segoe UI"/>
+          <w:color w:val="0F1115"/>
+        </w:rPr>
+        <w:t>single source of truth</w:t>
+      </w:r>
+      <w:r>
+        <w:rPr>
+          <w:rFonts w:ascii="Segoe UI" w:hAnsi="Segoe UI" w:cs="Segoe UI"/>
+          <w:color w:val="0F1115"/>
+        </w:rPr>
+        <w:t> that we both can reference!</w:t>
+      </w:r>
+    </w:p>
+    <w:p>
+      <w:pPr>
+        <w:rPr>
+          <w:rFonts w:ascii="Times New Roman" w:hAnsi="Times New Roman" w:cs="Times New Roman"/>
+        </w:rPr>
+      </w:pPr>
+    </w:p>
+    <w:p>
+      <w:pPr>
+        <w:tabs>
+          <w:tab w:val="left" w:pos="560"/>
+          <w:tab w:val="left" w:pos="1120"/>
+          <w:tab w:val="left" w:pos="1680"/>
+          <w:tab w:val="left" w:pos="2240"/>
+          <w:tab w:val="left" w:pos="2800"/>
+          <w:tab w:val="left" w:pos="3360"/>
+          <w:tab w:val="left" w:pos="3920"/>
+          <w:tab w:val="left" w:pos="4480"/>
+          <w:tab w:val="left" w:pos="5040"/>
+          <w:tab w:val="left" w:pos="5600"/>
+          <w:tab w:val="left" w:pos="6160"/>
+          <w:tab w:val="left" w:pos="6720"/>
+        </w:tabs>
+        <w:autoSpaceDE w:val="0"/>
+        <w:autoSpaceDN w:val="0"/>
+        <w:adjustRightInd w:val="0"/>
+        <w:spacing w:after="0" w:line="240" w:lineRule="auto"/>
+        <w:rPr>
+          <w:rFonts w:ascii="Menlo" w:hAnsi="Menlo" w:cs="Menlo"/>
+          <w:color w:val="000000"/>
+          <w:kern w:val="0"/>
+          <w:sz w:val="22"/>
+          <w:szCs w:val="22"/>
+        </w:rPr>
+      </w:pPr>
+      <w:r>
+        <w:t>Authentication backup codes</w:t>
+      </w:r>
+      <w:r>
+        <w:br/>
+      </w:r>
+      <w:r>
+        <w:rPr>
+          <w:rFonts w:ascii="Apple Color Emoji" w:hAnsi="Apple Color Emoji" w:cs="Apple Color Emoji"/>
+          <w:color w:val="000000"/>
+          <w:kern w:val="0"/>
+          <w:sz w:val="22"/>
+          <w:szCs w:val="22"/>
+        </w:rPr>
+        <w:t>📋</w:t>
+      </w:r>
+      <w:r>
+        <w:rPr>
+          <w:rFonts w:ascii="Menlo" w:hAnsi="Menlo" w:cs="Menlo"/>
+          <w:color w:val="000000"/>
+          <w:kern w:val="0"/>
+          <w:sz w:val="22"/>
+          <w:szCs w:val="22"/>
+        </w:rPr>
+        <w:t xml:space="preserve"> First 3 codes:</w:t>
+      </w:r>
+    </w:p>
+    <w:p>
+      <w:pPr>
+        <w:tabs>
+          <w:tab w:val="left" w:pos="560"/>
+          <w:tab w:val="left" w:pos="1120"/>
+          <w:tab w:val="left" w:pos="1680"/>
+          <w:tab w:val="left" w:pos="2240"/>
+          <w:tab w:val="left" w:pos="2800"/>
+          <w:tab w:val="left" w:pos="3360"/>
+          <w:tab w:val="left" w:pos="3920"/>
+          <w:tab w:val="left" w:pos="4480"/>
+          <w:tab w:val="left" w:pos="5040"/>
+          <w:tab w:val="left" w:pos="5600"/>
+          <w:tab w:val="left" w:pos="6160"/>
+          <w:tab w:val="left" w:pos="6720"/>
+        </w:tabs>
+        <w:autoSpaceDE w:val="0"/>
+        <w:autoSpaceDN w:val="0"/>
+        <w:adjustRightInd w:val="0"/>
+        <w:spacing w:after="0" w:line="240" w:lineRule="auto"/>
+        <w:rPr>
+          <w:rFonts w:ascii="Menlo" w:hAnsi="Menlo" w:cs="Menlo"/>
+          <w:color w:val="000000"/>
+          <w:kern w:val="0"/>
+          <w:sz w:val="22"/>
+          <w:szCs w:val="22"/>
+        </w:rPr>
+      </w:pPr>
+      <w:r>
+        <w:rPr>
+          <w:rFonts w:ascii="Menlo" w:hAnsi="Menlo" w:cs="Menlo"/>
+          <w:color w:val="000000"/>
+          <w:kern w:val="0"/>
+          <w:sz w:val="22"/>
+          <w:szCs w:val="22"/>
+        </w:rPr>
+        <w:t xml:space="preserve">   1. 65F9566F</w:t>
+      </w:r>
+    </w:p>
+    <w:p>
+      <w:pPr>
+        <w:tabs>
+          <w:tab w:val="left" w:pos="560"/>
+          <w:tab w:val="left" w:pos="1120"/>
+          <w:tab w:val="left" w:pos="1680"/>
+          <w:tab w:val="left" w:pos="2240"/>
+          <w:tab w:val="left" w:pos="2800"/>
+          <w:tab w:val="left" w:pos="3360"/>
+          <w:tab w:val="left" w:pos="3920"/>
+          <w:tab w:val="left" w:pos="4480"/>
+          <w:tab w:val="left" w:pos="5040"/>
+          <w:tab w:val="left" w:pos="5600"/>
+          <w:tab w:val="left" w:pos="6160"/>
+          <w:tab w:val="left" w:pos="6720"/>
+        </w:tabs>
+        <w:autoSpaceDE w:val="0"/>
+        <w:autoSpaceDN w:val="0"/>
+        <w:adjustRightInd w:val="0"/>
+        <w:spacing w:after="0" w:line="240" w:lineRule="auto"/>
+        <w:rPr>
+          <w:rFonts w:ascii="Menlo" w:hAnsi="Menlo" w:cs="Menlo"/>
+          <w:color w:val="000000"/>
+          <w:kern w:val="0"/>
+          <w:sz w:val="22"/>
+          <w:szCs w:val="22"/>
+        </w:rPr>
+      </w:pPr>
+      <w:r>
+        <w:rPr>
+          <w:rFonts w:ascii="Menlo" w:hAnsi="Menlo" w:cs="Menlo"/>
+          <w:color w:val="000000"/>
+          <w:kern w:val="0"/>
+          <w:sz w:val="22"/>
+          <w:szCs w:val="22"/>
+        </w:rPr>
+        <w:t xml:space="preserve">   2. 6DEA9730</w:t>
+      </w:r>
+    </w:p>
+    <w:p>
+      <w:pPr>
+        <w:rPr>
+          <w:rFonts w:ascii="Menlo" w:hAnsi="Menlo" w:cs="Menlo"/>
+          <w:color w:val="000000"/>
+          <w:kern w:val="0"/>
+          <w:sz w:val="22"/>
+          <w:szCs w:val="22"/>
+        </w:rPr>
+      </w:pPr>
+      <w:r>
+        <w:rPr>
+          <w:rFonts w:ascii="Menlo" w:hAnsi="Menlo" w:cs="Menlo"/>
+          <w:color w:val="000000"/>
+          <w:kern w:val="0"/>
+          <w:sz w:val="22"/>
+          <w:szCs w:val="22"/>
+        </w:rPr>
+        <w:t xml:space="preserve">   3. 03D7B654</w:t>
+      </w:r>
+    </w:p>
+    <w:p>
+      <w:pPr>
+        <w:tabs>
+          <w:tab w:val="left" w:pos="560"/>
+          <w:tab w:val="left" w:pos="1120"/>
+          <w:tab w:val="left" w:pos="1680"/>
+          <w:tab w:val="left" w:pos="2240"/>
+          <w:tab w:val="left" w:pos="2800"/>
+          <w:tab w:val="left" w:pos="3360"/>
+          <w:tab w:val="left" w:pos="3920"/>
+          <w:tab w:val="left" w:pos="4480"/>
+          <w:tab w:val="left" w:pos="5040"/>
+          <w:tab w:val="left" w:pos="5600"/>
+          <w:tab w:val="left" w:pos="6160"/>
+          <w:tab w:val="left" w:pos="6720"/>
+        </w:tabs>
+        <w:autoSpaceDE w:val="0"/>
+        <w:autoSpaceDN w:val="0"/>
+        <w:adjustRightInd w:val="0"/>
+        <w:spacing w:after="0" w:line="240" w:lineRule="auto"/>
+        <w:rPr>
+          <w:rFonts w:ascii="Menlo" w:hAnsi="Menlo" w:cs="Menlo"/>
+          <w:color w:val="000000"/>
+          <w:kern w:val="0"/>
+          <w:sz w:val="22"/>
+          <w:szCs w:val="22"/>
+        </w:rPr>
+      </w:pPr>
+      <w:r>
+        <w:rPr>
+          <w:rFonts w:ascii="Menlo" w:hAnsi="Menlo" w:cs="Menlo"/>
+          <w:color w:val="000000"/>
+          <w:kern w:val="0"/>
+          <w:sz w:val="22"/>
+          <w:szCs w:val="22"/>
+        </w:rPr>
+        <w:t>DMAI EMERGENCY BACKUP CODES</w:t>
+      </w:r>
+    </w:p>
+    <w:p>
+      <w:pPr>
+        <w:tabs>
+          <w:tab w:val="left" w:pos="560"/>
+          <w:tab w:val="left" w:pos="1120"/>
+          <w:tab w:val="left" w:pos="1680"/>
+          <w:tab w:val="left" w:pos="2240"/>
+          <w:tab w:val="left" w:pos="2800"/>
+          <w:tab w:val="left" w:pos="3360"/>
+          <w:tab w:val="left" w:pos="3920"/>
+          <w:tab w:val="left" w:pos="4480"/>
+          <w:tab w:val="left" w:pos="5040"/>
+          <w:tab w:val="left" w:pos="5600"/>
+          <w:tab w:val="left" w:pos="6160"/>
+          <w:tab w:val="left" w:pos="6720"/>
+        </w:tabs>
+        <w:autoSpaceDE w:val="0"/>
+        <w:autoSpaceDN w:val="0"/>
+        <w:adjustRightInd w:val="0"/>
+        <w:spacing w:after="0" w:line="240" w:lineRule="auto"/>
+        <w:rPr>
+          <w:rFonts w:ascii="Menlo" w:hAnsi="Menlo" w:cs="Menlo"/>
+          <w:color w:val="000000"/>
+          <w:kern w:val="0"/>
+          <w:sz w:val="22"/>
+          <w:szCs w:val="22"/>
+        </w:rPr>
+      </w:pPr>
+      <w:r>
+        <w:rPr>
+          <w:rFonts w:ascii="Menlo" w:hAnsi="Menlo" w:cs="Menlo"/>
+          <w:color w:val="000000"/>
+          <w:kern w:val="0"/>
+          <w:sz w:val="22"/>
+          <w:szCs w:val="22"/>
+        </w:rPr>
+        <w:t>==================================================</w:t>
+      </w:r>
+    </w:p>
+    <w:p>
+      <w:pPr>
+        <w:tabs>
+          <w:tab w:val="left" w:pos="560"/>
+          <w:tab w:val="left" w:pos="1120"/>
+          <w:tab w:val="left" w:pos="1680"/>
+          <w:tab w:val="left" w:pos="2240"/>
+          <w:tab w:val="left" w:pos="2800"/>
+          <w:tab w:val="left" w:pos="3360"/>
+          <w:tab w:val="left" w:pos="3920"/>
+          <w:tab w:val="left" w:pos="4480"/>
+          <w:tab w:val="left" w:pos="5040"/>
+          <w:tab w:val="left" w:pos="5600"/>
+          <w:tab w:val="left" w:pos="6160"/>
+          <w:tab w:val="left" w:pos="6720"/>
+        </w:tabs>
+        <w:autoSpaceDE w:val="0"/>
+        <w:autoSpaceDN w:val="0"/>
+        <w:adjustRightInd w:val="0"/>
+        <w:spacing w:after="0" w:line="240" w:lineRule="auto"/>
+        <w:rPr>
+          <w:rFonts w:ascii="Menlo" w:hAnsi="Menlo" w:cs="Menlo"/>
+          <w:color w:val="000000"/>
+          <w:kern w:val="0"/>
+          <w:sz w:val="22"/>
+          <w:szCs w:val="22"/>
+        </w:rPr>
+      </w:pPr>
+      <w:r>
+        <w:rPr>
+          <w:rFonts w:ascii="Menlo" w:hAnsi="Menlo" w:cs="Menlo"/>
+          <w:color w:val="000000"/>
+          <w:kern w:val="0"/>
+          <w:sz w:val="22"/>
+          <w:szCs w:val="22"/>
+        </w:rPr>
+        <w:t>Generated: 2026-03-06T09:20:51.979410</w:t>
+      </w:r>
+    </w:p>
+    <w:p>
+      <w:pPr>
+        <w:tabs>
+          <w:tab w:val="left" w:pos="560"/>
+          <w:tab w:val="left" w:pos="1120"/>
+          <w:tab w:val="left" w:pos="1680"/>
+          <w:tab w:val="left" w:pos="2240"/>
+          <w:tab w:val="left" w:pos="2800"/>
+          <w:tab w:val="left" w:pos="3360"/>
+          <w:tab w:val="left" w:pos="3920"/>
+          <w:tab w:val="left" w:pos="4480"/>
+          <w:tab w:val="left" w:pos="5040"/>
+          <w:tab w:val="left" w:pos="5600"/>
+          <w:tab w:val="left" w:pos="6160"/>
+          <w:tab w:val="left" w:pos="6720"/>
+        </w:tabs>
+        <w:autoSpaceDE w:val="0"/>
+        <w:autoSpaceDN w:val="0"/>
+        <w:adjustRightInd w:val="0"/>
+        <w:spacing w:after="0" w:line="240" w:lineRule="auto"/>
+        <w:rPr>
+          <w:rFonts w:ascii="Menlo" w:hAnsi="Menlo" w:cs="Menlo"/>
+          <w:color w:val="000000"/>
+          <w:kern w:val="0"/>
+          <w:sz w:val="22"/>
+          <w:szCs w:val="22"/>
+        </w:rPr>
+      </w:pPr>
+      <w:r>
+        <w:rPr>
+          <w:rFonts w:ascii="Menlo" w:hAnsi="Menlo" w:cs="Menlo"/>
+          <w:color w:val="000000"/>
+          <w:kern w:val="0"/>
+          <w:sz w:val="22"/>
+          <w:szCs w:val="22"/>
+        </w:rPr>
+        <w:t>Store these in a SAFE place!</w:t>
+      </w:r>
+    </w:p>
+    <w:p>
+      <w:pPr>
+        <w:tabs>
+          <w:tab w:val="left" w:pos="560"/>
+          <w:tab w:val="left" w:pos="1120"/>
+          <w:tab w:val="left" w:pos="1680"/>
+          <w:tab w:val="left" w:pos="2240"/>
+          <w:tab w:val="left" w:pos="2800"/>
+          <w:tab w:val="left" w:pos="3360"/>
+          <w:tab w:val="left" w:pos="3920"/>
+          <w:tab w:val="left" w:pos="4480"/>
+          <w:tab w:val="left" w:pos="5040"/>
+          <w:tab w:val="left" w:pos="5600"/>
+          <w:tab w:val="left" w:pos="6160"/>
+          <w:tab w:val="left" w:pos="6720"/>
+        </w:tabs>
+        <w:autoSpaceDE w:val="0"/>
+        <w:autoSpaceDN w:val="0"/>
+        <w:adjustRightInd w:val="0"/>
+        <w:spacing w:after="0" w:line="240" w:lineRule="auto"/>
+        <w:rPr>
+          <w:rFonts w:ascii="Menlo" w:hAnsi="Menlo" w:cs="Menlo"/>
+          <w:color w:val="000000"/>
+          <w:kern w:val="0"/>
+          <w:sz w:val="22"/>
+          <w:szCs w:val="22"/>
+        </w:rPr>
+      </w:pPr>
+      <w:r>
+        <w:rPr>
+          <w:rFonts w:ascii="Menlo" w:hAnsi="Menlo" w:cs="Menlo"/>
+          <w:color w:val="000000"/>
+          <w:kern w:val="0"/>
+          <w:sz w:val="22"/>
+          <w:szCs w:val="22"/>
+        </w:rPr>
+        <w:t>Each code can only be used once.</w:t>
+      </w:r>
+    </w:p>
+    <w:p>
+      <w:pPr>
+        <w:tabs>
+          <w:tab w:val="left" w:pos="560"/>
+          <w:tab w:val="left" w:pos="1120"/>
+          <w:tab w:val="left" w:pos="1680"/>
+          <w:tab w:val="left" w:pos="2240"/>
+          <w:tab w:val="left" w:pos="2800"/>
+          <w:tab w:val="left" w:pos="3360"/>
+          <w:tab w:val="left" w:pos="3920"/>
+          <w:tab w:val="left" w:pos="4480"/>
+          <w:tab w:val="left" w:pos="5040"/>
+          <w:tab w:val="left" w:pos="5600"/>
+          <w:tab w:val="left" w:pos="6160"/>
+          <w:tab w:val="left" w:pos="6720"/>
+        </w:tabs>
+        <w:autoSpaceDE w:val="0"/>
+        <w:autoSpaceDN w:val="0"/>
+        <w:adjustRightInd w:val="0"/>
+        <w:spacing w:after="0" w:line="240" w:lineRule="auto"/>
+        <w:rPr>
+          <w:rFonts w:ascii="Menlo" w:hAnsi="Menlo" w:cs="Menlo"/>
+          <w:color w:val="000000"/>
+          <w:kern w:val="0"/>
+          <w:sz w:val="22"/>
+          <w:szCs w:val="22"/>
+        </w:rPr>
+      </w:pPr>
+      <w:r>
+        <w:rPr>
+          <w:rFonts w:ascii="Menlo" w:hAnsi="Menlo" w:cs="Menlo"/>
+          <w:color w:val="000000"/>
+          <w:kern w:val="0"/>
+          <w:sz w:val="22"/>
+          <w:szCs w:val="22"/>
+        </w:rPr>
+        <w:t>==================================================</w:t>
+      </w:r>
+    </w:p>
+    <w:p>
+      <w:pPr>
+        <w:tabs>
+          <w:tab w:val="left" w:pos="560"/>
+          <w:tab w:val="left" w:pos="1120"/>
+          <w:tab w:val="left" w:pos="1680"/>
+          <w:tab w:val="left" w:pos="2240"/>
+          <w:tab w:val="left" w:pos="2800"/>
+          <w:tab w:val="left" w:pos="3360"/>
+          <w:tab w:val="left" w:pos="3920"/>
+          <w:tab w:val="left" w:pos="4480"/>
+          <w:tab w:val="left" w:pos="5040"/>
+          <w:tab w:val="left" w:pos="5600"/>
+          <w:tab w:val="left" w:pos="6160"/>
+          <w:tab w:val="left" w:pos="6720"/>
+        </w:tabs>
+        <w:autoSpaceDE w:val="0"/>
+        <w:autoSpaceDN w:val="0"/>
+        <w:adjustRightInd w:val="0"/>
+        <w:spacing w:after="0" w:line="240" w:lineRule="auto"/>
+        <w:rPr>
+          <w:rFonts w:ascii="Menlo" w:hAnsi="Menlo" w:cs="Menlo"/>
+          <w:color w:val="000000"/>
+          <w:kern w:val="0"/>
+          <w:sz w:val="22"/>
+          <w:szCs w:val="22"/>
+        </w:rPr>
+      </w:pPr>
+    </w:p>
+    <w:p>
+      <w:pPr>
+        <w:tabs>
+          <w:tab w:val="left" w:pos="560"/>
+          <w:tab w:val="left" w:pos="1120"/>
+          <w:tab w:val="left" w:pos="1680"/>
+          <w:tab w:val="left" w:pos="2240"/>
+          <w:tab w:val="left" w:pos="2800"/>
+          <w:tab w:val="left" w:pos="3360"/>
+          <w:tab w:val="left" w:pos="3920"/>
+          <w:tab w:val="left" w:pos="4480"/>
+          <w:tab w:val="left" w:pos="5040"/>
+          <w:tab w:val="left" w:pos="5600"/>
+          <w:tab w:val="left" w:pos="6160"/>
+          <w:tab w:val="left" w:pos="6720"/>
+        </w:tabs>
+        <w:autoSpaceDE w:val="0"/>
+        <w:autoSpaceDN w:val="0"/>
+        <w:adjustRightInd w:val="0"/>
+        <w:spacing w:after="0" w:line="240" w:lineRule="auto"/>
+        <w:rPr>
+          <w:rFonts w:ascii="Menlo" w:hAnsi="Menlo" w:cs="Menlo"/>
+          <w:color w:val="000000"/>
+          <w:kern w:val="0"/>
+          <w:sz w:val="22"/>
+          <w:szCs w:val="22"/>
+        </w:rPr>
+      </w:pPr>
+      <w:r>
+        <w:rPr>
+          <w:rFonts w:ascii="Menlo" w:hAnsi="Menlo" w:cs="Menlo"/>
+          <w:color w:val="000000"/>
+          <w:kern w:val="0"/>
+          <w:sz w:val="22"/>
+          <w:szCs w:val="22"/>
+        </w:rPr>
+        <w:t xml:space="preserve"> 1. 33ABDAFB</w:t>
+      </w:r>
+    </w:p>
+    <w:p>
+      <w:pPr>
+        <w:tabs>
+          <w:tab w:val="left" w:pos="560"/>
+          <w:tab w:val="left" w:pos="1120"/>
+          <w:tab w:val="left" w:pos="1680"/>
+          <w:tab w:val="left" w:pos="2240"/>
+          <w:tab w:val="left" w:pos="2800"/>
+          <w:tab w:val="left" w:pos="3360"/>
+          <w:tab w:val="left" w:pos="3920"/>
+          <w:tab w:val="left" w:pos="4480"/>
+          <w:tab w:val="left" w:pos="5040"/>
+          <w:tab w:val="left" w:pos="5600"/>
+          <w:tab w:val="left" w:pos="6160"/>
+          <w:tab w:val="left" w:pos="6720"/>
+        </w:tabs>
+        <w:autoSpaceDE w:val="0"/>
+        <w:autoSpaceDN w:val="0"/>
+        <w:adjustRightInd w:val="0"/>
+        <w:spacing w:after="0" w:line="240" w:lineRule="auto"/>
+        <w:rPr>
+          <w:rFonts w:ascii="Menlo" w:hAnsi="Menlo" w:cs="Menlo"/>
+          <w:color w:val="000000"/>
+          <w:kern w:val="0"/>
+          <w:sz w:val="22"/>
+          <w:szCs w:val="22"/>
+        </w:rPr>
+      </w:pPr>
+      <w:r>
+        <w:rPr>
+          <w:rFonts w:ascii="Menlo" w:hAnsi="Menlo" w:cs="Menlo"/>
+          <w:color w:val="000000"/>
+          <w:kern w:val="0"/>
+          <w:sz w:val="22"/>
+          <w:szCs w:val="22"/>
+        </w:rPr>
+        <w:t xml:space="preserve"> 2. C72BB87B</w:t>
+      </w:r>
+    </w:p>
+    <w:p>
+      <w:pPr>
+        <w:tabs>
+          <w:tab w:val="left" w:pos="560"/>
+          <w:tab w:val="left" w:pos="1120"/>
+          <w:tab w:val="left" w:pos="1680"/>
+          <w:tab w:val="left" w:pos="2240"/>
+          <w:tab w:val="left" w:pos="2800"/>
+          <w:tab w:val="left" w:pos="3360"/>
+          <w:tab w:val="left" w:pos="3920"/>
+          <w:tab w:val="left" w:pos="4480"/>
+          <w:tab w:val="left" w:pos="5040"/>
+          <w:tab w:val="left" w:pos="5600"/>
+          <w:tab w:val="left" w:pos="6160"/>
+          <w:tab w:val="left" w:pos="6720"/>
+        </w:tabs>
+        <w:autoSpaceDE w:val="0"/>
+        <w:autoSpaceDN w:val="0"/>
+        <w:adjustRightInd w:val="0"/>
+        <w:spacing w:after="0" w:line="240" w:lineRule="auto"/>
+        <w:rPr>
+          <w:rFonts w:ascii="Menlo" w:hAnsi="Menlo" w:cs="Menlo"/>
+          <w:color w:val="000000"/>
+          <w:kern w:val="0"/>
+          <w:sz w:val="22"/>
+          <w:szCs w:val="22"/>
+        </w:rPr>
+      </w:pPr>
+      <w:r>
+        <w:rPr>
+          <w:rFonts w:ascii="Menlo" w:hAnsi="Menlo" w:cs="Menlo"/>
+          <w:color w:val="000000"/>
+          <w:kern w:val="0"/>
+          <w:sz w:val="22"/>
+          <w:szCs w:val="22"/>
+        </w:rPr>
+        <w:t xml:space="preserve"> 3. 13437745</w:t>
+      </w:r>
+    </w:p>
+    <w:p>
+      <w:pPr>
+        <w:tabs>
+          <w:tab w:val="left" w:pos="560"/>
+          <w:tab w:val="left" w:pos="1120"/>
+          <w:tab w:val="left" w:pos="1680"/>
+          <w:tab w:val="left" w:pos="2240"/>
+          <w:tab w:val="left" w:pos="2800"/>
+          <w:tab w:val="left" w:pos="3360"/>
+          <w:tab w:val="left" w:pos="3920"/>
+          <w:tab w:val="left" w:pos="4480"/>
+          <w:tab w:val="left" w:pos="5040"/>
+          <w:tab w:val="left" w:pos="5600"/>
+          <w:tab w:val="left" w:pos="6160"/>
+          <w:tab w:val="left" w:pos="6720"/>
+        </w:tabs>
+        <w:autoSpaceDE w:val="0"/>
+        <w:autoSpaceDN w:val="0"/>
+        <w:adjustRightInd w:val="0"/>
+        <w:spacing w:after="0" w:line="240" w:lineRule="auto"/>
+        <w:rPr>
+          <w:rFonts w:ascii="Menlo" w:hAnsi="Menlo" w:cs="Menlo"/>
+          <w:color w:val="000000"/>
+          <w:kern w:val="0"/>
+          <w:sz w:val="22"/>
+          <w:szCs w:val="22"/>
+        </w:rPr>
+      </w:pPr>
+      <w:r>
+        <w:rPr>
+          <w:rFonts w:ascii="Menlo" w:hAnsi="Menlo" w:cs="Menlo"/>
+          <w:color w:val="000000"/>
+          <w:kern w:val="0"/>
+          <w:sz w:val="22"/>
+          <w:szCs w:val="22"/>
+        </w:rPr>
+        <w:t xml:space="preserve"> 4. 5CDE654C</w:t>
+      </w:r>
+    </w:p>
+    <w:p>
+      <w:pPr>
+        <w:tabs>
+          <w:tab w:val="left" w:pos="560"/>
+          <w:tab w:val="left" w:pos="1120"/>
+          <w:tab w:val="left" w:pos="1680"/>
+          <w:tab w:val="left" w:pos="2240"/>
+          <w:tab w:val="left" w:pos="2800"/>
+          <w:tab w:val="left" w:pos="3360"/>
+          <w:tab w:val="left" w:pos="3920"/>
+          <w:tab w:val="left" w:pos="4480"/>
+          <w:tab w:val="left" w:pos="5040"/>
+          <w:tab w:val="left" w:pos="5600"/>
+          <w:tab w:val="left" w:pos="6160"/>
+          <w:tab w:val="left" w:pos="6720"/>
+        </w:tabs>
+        <w:autoSpaceDE w:val="0"/>
+        <w:autoSpaceDN w:val="0"/>
+        <w:adjustRightInd w:val="0"/>
+        <w:spacing w:after="0" w:line="240" w:lineRule="auto"/>
+        <w:rPr>
+          <w:rFonts w:ascii="Menlo" w:hAnsi="Menlo" w:cs="Menlo"/>
+          <w:color w:val="000000"/>
+          <w:kern w:val="0"/>
+          <w:sz w:val="22"/>
+          <w:szCs w:val="22"/>
+        </w:rPr>
+      </w:pPr>
+      <w:r>
+        <w:rPr>
+          <w:rFonts w:ascii="Menlo" w:hAnsi="Menlo" w:cs="Menlo"/>
+          <w:color w:val="000000"/>
+          <w:kern w:val="0"/>
+          <w:sz w:val="22"/>
+          <w:szCs w:val="22"/>
+        </w:rPr>
+        <w:t xml:space="preserve"> 5. 70446A66</w:t>
+      </w:r>
+    </w:p>
+    <w:p>
+      <w:pPr>
+        <w:tabs>
+          <w:tab w:val="left" w:pos="560"/>
+          <w:tab w:val="left" w:pos="1120"/>
+          <w:tab w:val="left" w:pos="1680"/>
+          <w:tab w:val="left" w:pos="2240"/>
+          <w:tab w:val="left" w:pos="2800"/>
+          <w:tab w:val="left" w:pos="3360"/>
+          <w:tab w:val="left" w:pos="3920"/>
+          <w:tab w:val="left" w:pos="4480"/>
+          <w:tab w:val="left" w:pos="5040"/>
+          <w:tab w:val="left" w:pos="5600"/>
+          <w:tab w:val="left" w:pos="6160"/>
+          <w:tab w:val="left" w:pos="6720"/>
+        </w:tabs>
+        <w:autoSpaceDE w:val="0"/>
+        <w:autoSpaceDN w:val="0"/>
+        <w:adjustRightInd w:val="0"/>
+        <w:spacing w:after="0" w:line="240" w:lineRule="auto"/>
+        <w:rPr>
+          <w:rFonts w:ascii="Menlo" w:hAnsi="Menlo" w:cs="Menlo"/>
+          <w:color w:val="000000"/>
+          <w:kern w:val="0"/>
+          <w:sz w:val="22"/>
+          <w:szCs w:val="22"/>
+        </w:rPr>
+      </w:pPr>
+      <w:r>
+        <w:rPr>
+          <w:rFonts w:ascii="Menlo" w:hAnsi="Menlo" w:cs="Menlo"/>
+          <w:color w:val="000000"/>
+          <w:kern w:val="0"/>
+          <w:sz w:val="22"/>
+          <w:szCs w:val="22"/>
+        </w:rPr>
+        <w:t xml:space="preserve"> 6. 2A3808F0</w:t>
+      </w:r>
+    </w:p>
+    <w:p>
+      <w:pPr>
+        <w:tabs>
+          <w:tab w:val="left" w:pos="560"/>
+          <w:tab w:val="left" w:pos="1120"/>
+          <w:tab w:val="left" w:pos="1680"/>
+          <w:tab w:val="left" w:pos="2240"/>
+          <w:tab w:val="left" w:pos="2800"/>
+          <w:tab w:val="left" w:pos="3360"/>
+          <w:tab w:val="left" w:pos="3920"/>
+          <w:tab w:val="left" w:pos="4480"/>
+          <w:tab w:val="left" w:pos="5040"/>
+          <w:tab w:val="left" w:pos="5600"/>
+          <w:tab w:val="left" w:pos="6160"/>
+          <w:tab w:val="left" w:pos="6720"/>
+        </w:tabs>
+        <w:autoSpaceDE w:val="0"/>
+        <w:autoSpaceDN w:val="0"/>
+        <w:adjustRightInd w:val="0"/>
+        <w:spacing w:after="0" w:line="240" w:lineRule="auto"/>
+        <w:rPr>
+          <w:rFonts w:ascii="Menlo" w:hAnsi="Menlo" w:cs="Menlo"/>
+          <w:color w:val="000000"/>
+          <w:kern w:val="0"/>
+          <w:sz w:val="22"/>
+          <w:szCs w:val="22"/>
+        </w:rPr>
+      </w:pPr>
+      <w:r>
+        <w:rPr>
+          <w:rFonts w:ascii="Menlo" w:hAnsi="Menlo" w:cs="Menlo"/>
+          <w:color w:val="000000"/>
+          <w:kern w:val="0"/>
+          <w:sz w:val="22"/>
+          <w:szCs w:val="22"/>
+        </w:rPr>
+        <w:t xml:space="preserve"> 7. 66B43660</w:t>
+      </w:r>
+    </w:p>
+    <w:p>
+      <w:pPr>
+        <w:tabs>
+          <w:tab w:val="left" w:pos="560"/>
+          <w:tab w:val="left" w:pos="1120"/>
+          <w:tab w:val="left" w:pos="1680"/>
+          <w:tab w:val="left" w:pos="2240"/>
+          <w:tab w:val="left" w:pos="2800"/>
+          <w:tab w:val="left" w:pos="3360"/>
+          <w:tab w:val="left" w:pos="3920"/>
+          <w:tab w:val="left" w:pos="4480"/>
+          <w:tab w:val="left" w:pos="5040"/>
+          <w:tab w:val="left" w:pos="5600"/>
+          <w:tab w:val="left" w:pos="6160"/>
+          <w:tab w:val="left" w:pos="6720"/>
+        </w:tabs>
+        <w:autoSpaceDE w:val="0"/>
+        <w:autoSpaceDN w:val="0"/>
+        <w:adjustRightInd w:val="0"/>
+        <w:spacing w:after="0" w:line="240" w:lineRule="auto"/>
+        <w:rPr>
+          <w:rFonts w:ascii="Menlo" w:hAnsi="Menlo" w:cs="Menlo"/>
+          <w:color w:val="000000"/>
+          <w:kern w:val="0"/>
+          <w:sz w:val="22"/>
+          <w:szCs w:val="22"/>
+        </w:rPr>
+      </w:pPr>
+      <w:r>
+        <w:rPr>
+          <w:rFonts w:ascii="Menlo" w:hAnsi="Menlo" w:cs="Menlo"/>
+          <w:color w:val="000000"/>
+          <w:kern w:val="0"/>
+          <w:sz w:val="22"/>
+          <w:szCs w:val="22"/>
+        </w:rPr>
+        <w:t xml:space="preserve"> 8. A611F280</w:t>
+      </w:r>
+    </w:p>
+    <w:p>
+      <w:pPr>
+        <w:tabs>
+          <w:tab w:val="left" w:pos="560"/>
+          <w:tab w:val="left" w:pos="1120"/>
+          <w:tab w:val="left" w:pos="1680"/>
+          <w:tab w:val="left" w:pos="2240"/>
+          <w:tab w:val="left" w:pos="2800"/>
+          <w:tab w:val="left" w:pos="3360"/>
+          <w:tab w:val="left" w:pos="3920"/>
+          <w:tab w:val="left" w:pos="4480"/>
+          <w:tab w:val="left" w:pos="5040"/>
+          <w:tab w:val="left" w:pos="5600"/>
+          <w:tab w:val="left" w:pos="6160"/>
+          <w:tab w:val="left" w:pos="6720"/>
+        </w:tabs>
+        <w:autoSpaceDE w:val="0"/>
+        <w:autoSpaceDN w:val="0"/>
+        <w:adjustRightInd w:val="0"/>
+        <w:spacing w:after="0" w:line="240" w:lineRule="auto"/>
+        <w:rPr>
+          <w:rFonts w:ascii="Menlo" w:hAnsi="Menlo" w:cs="Menlo"/>
+          <w:color w:val="000000"/>
+          <w:kern w:val="0"/>
+          <w:sz w:val="22"/>
+          <w:szCs w:val="22"/>
+        </w:rPr>
+      </w:pPr>
+      <w:r>
+        <w:rPr>
+          <w:rFonts w:ascii="Menlo" w:hAnsi="Menlo" w:cs="Menlo"/>
+          <w:color w:val="000000"/>
+          <w:kern w:val="0"/>
+          <w:sz w:val="22"/>
+          <w:szCs w:val="22"/>
+        </w:rPr>
+        <w:t xml:space="preserve"> 9. F39104A7</w:t>
+      </w:r>
+    </w:p>
+    <w:p>
+      <w:pPr>
+        <w:tabs>
+          <w:tab w:val="left" w:pos="560"/>
+          <w:tab w:val="left" w:pos="1120"/>
+          <w:tab w:val="left" w:pos="1680"/>
+          <w:tab w:val="left" w:pos="2240"/>
+          <w:tab w:val="left" w:pos="2800"/>
+          <w:tab w:val="left" w:pos="3360"/>
+          <w:tab w:val="left" w:pos="3920"/>
+          <w:tab w:val="left" w:pos="4480"/>
+          <w:tab w:val="left" w:pos="5040"/>
+          <w:tab w:val="left" w:pos="5600"/>
+          <w:tab w:val="left" w:pos="6160"/>
+          <w:tab w:val="left" w:pos="6720"/>
+        </w:tabs>
+        <w:autoSpaceDE w:val="0"/>
+        <w:autoSpaceDN w:val="0"/>
+        <w:adjustRightInd w:val="0"/>
+        <w:spacing w:after="0" w:line="240" w:lineRule="auto"/>
+        <w:rPr>
+          <w:rFonts w:ascii="Menlo" w:hAnsi="Menlo" w:cs="Menlo"/>
+          <w:color w:val="000000"/>
+          <w:kern w:val="0"/>
+          <w:sz w:val="22"/>
+          <w:szCs w:val="22"/>
+        </w:rPr>
+      </w:pPr>
+      <w:r>
+        <w:rPr>
+          <w:rFonts w:ascii="Menlo" w:hAnsi="Menlo" w:cs="Menlo"/>
+          <w:color w:val="000000"/>
+          <w:kern w:val="0"/>
+          <w:sz w:val="22"/>
+          <w:szCs w:val="22"/>
+        </w:rPr>
+        <w:t>10. 4A8E6156</w:t>
+      </w:r>
+    </w:p>
+    <w:p>
+      <w:pPr>
+        <w:tabs>
+          <w:tab w:val="left" w:pos="560"/>
+          <w:tab w:val="left" w:pos="1120"/>
+          <w:tab w:val="left" w:pos="1680"/>
+          <w:tab w:val="left" w:pos="2240"/>
+          <w:tab w:val="left" w:pos="2800"/>
+          <w:tab w:val="left" w:pos="3360"/>
+          <w:tab w:val="left" w:pos="3920"/>
+          <w:tab w:val="left" w:pos="4480"/>
+          <w:tab w:val="left" w:pos="5040"/>
+          <w:tab w:val="left" w:pos="5600"/>
+          <w:tab w:val="left" w:pos="6160"/>
+          <w:tab w:val="left" w:pos="6720"/>
+        </w:tabs>
+        <w:autoSpaceDE w:val="0"/>
+        <w:autoSpaceDN w:val="0"/>
+        <w:adjustRightInd w:val="0"/>
+        <w:spacing w:after="0" w:line="240" w:lineRule="auto"/>
+        <w:rPr>
+          <w:rFonts w:ascii="Menlo" w:hAnsi="Menlo" w:cs="Menlo"/>
+          <w:color w:val="000000"/>
+          <w:kern w:val="0"/>
+          <w:sz w:val="22"/>
+          <w:szCs w:val="22"/>
+        </w:rPr>
+      </w:pPr>
+    </w:p>
+    <w:p>
+      <w:pPr>
+        <w:tabs>
+          <w:tab w:val="left" w:pos="560"/>
+          <w:tab w:val="left" w:pos="1120"/>
+          <w:tab w:val="left" w:pos="1680"/>
+          <w:tab w:val="left" w:pos="2240"/>
+          <w:tab w:val="left" w:pos="2800"/>
+          <w:tab w:val="left" w:pos="3360"/>
+          <w:tab w:val="left" w:pos="3920"/>
+          <w:tab w:val="left" w:pos="4480"/>
+          <w:tab w:val="left" w:pos="5040"/>
+          <w:tab w:val="left" w:pos="5600"/>
+          <w:tab w:val="left" w:pos="6160"/>
+          <w:tab w:val="left" w:pos="6720"/>
+        </w:tabs>
+        <w:autoSpaceDE w:val="0"/>
+        <w:autoSpaceDN w:val="0"/>
+        <w:adjustRightInd w:val="0"/>
+        <w:spacing w:after="0" w:line="240" w:lineRule="auto"/>
+        <w:rPr>
+          <w:rFonts w:ascii="Menlo" w:hAnsi="Menlo" w:cs="Menlo"/>
+          <w:color w:val="000000"/>
+          <w:kern w:val="0"/>
+          <w:sz w:val="22"/>
+          <w:szCs w:val="22"/>
+        </w:rPr>
+      </w:pPr>
+      <w:r>
+        <w:rPr>
+          <w:rFonts w:ascii="Menlo" w:hAnsi="Menlo" w:cs="Menlo"/>
+          <w:color w:val="000000"/>
+          <w:kern w:val="0"/>
+          <w:sz w:val="22"/>
+          <w:szCs w:val="22"/>
+        </w:rPr>
+        <w:t>==================================================</w:t>
+      </w:r>
+    </w:p>
+    <w:p>
+      <w:pPr>
+        <w:tabs>
+          <w:tab w:val="left" w:pos="560"/>
+          <w:tab w:val="left" w:pos="1120"/>
+          <w:tab w:val="left" w:pos="1680"/>
+          <w:tab w:val="left" w:pos="2240"/>
+          <w:tab w:val="left" w:pos="2800"/>
+          <w:tab w:val="left" w:pos="3360"/>
+          <w:tab w:val="left" w:pos="3920"/>
+          <w:tab w:val="left" w:pos="4480"/>
+          <w:tab w:val="left" w:pos="5040"/>
+          <w:tab w:val="left" w:pos="5600"/>
+          <w:tab w:val="left" w:pos="6160"/>
+          <w:tab w:val="left" w:pos="6720"/>
+        </w:tabs>
+        <w:autoSpaceDE w:val="0"/>
+        <w:autoSpaceDN w:val="0"/>
+        <w:adjustRightInd w:val="0"/>
+        <w:spacing w:after="0" w:line="240" w:lineRule="auto"/>
+        <w:rPr>
+          <w:rFonts w:ascii="Menlo" w:hAnsi="Menlo" w:cs="Menlo"/>
+          <w:color w:val="000000"/>
+          <w:kern w:val="0"/>
+          <w:sz w:val="22"/>
+          <w:szCs w:val="22"/>
+        </w:rPr>
+      </w:pPr>
+      <w:r>
+        <w:rPr>
+          <w:rFonts w:ascii="Menlo" w:hAnsi="Menlo" w:cs="Menlo"/>
+          <w:color w:val="000000"/>
+          <w:kern w:val="0"/>
+          <w:sz w:val="22"/>
+          <w:szCs w:val="22"/>
+        </w:rPr>
+        <w:t>KEEP THIS FILE SECURE!</w:t>
+      </w:r>
+    </w:p>
+    <w:p>
+      <w:pPr>
+        <w:tabs>
+          <w:tab w:val="left" w:pos="560"/>
+          <w:tab w:val="left" w:pos="1120"/>
+          <w:tab w:val="left" w:pos="1680"/>
+          <w:tab w:val="left" w:pos="2240"/>
+          <w:tab w:val="left" w:pos="2800"/>
+          <w:tab w:val="left" w:pos="3360"/>
+          <w:tab w:val="left" w:pos="3920"/>
+          <w:tab w:val="left" w:pos="4480"/>
+          <w:tab w:val="left" w:pos="5040"/>
+          <w:tab w:val="left" w:pos="5600"/>
+          <w:tab w:val="left" w:pos="6160"/>
+          <w:tab w:val="left" w:pos="6720"/>
+        </w:tabs>
+        <w:autoSpaceDE w:val="0"/>
+        <w:autoSpaceDN w:val="0"/>
+        <w:adjustRightInd w:val="0"/>
+        <w:spacing w:after="0" w:line="240" w:lineRule="auto"/>
+        <w:rPr>
+          <w:rFonts w:ascii="Menlo" w:hAnsi="Menlo" w:cs="Menlo"/>
+          <w:color w:val="000000"/>
+          <w:kern w:val="0"/>
+          <w:sz w:val="22"/>
+          <w:szCs w:val="22"/>
+        </w:rPr>
+      </w:pPr>
+      <w:r>
+        <w:rPr>
+          <w:rFonts w:ascii="Menlo" w:hAnsi="Menlo" w:cs="Menlo"/>
+          <w:color w:val="000000"/>
+          <w:kern w:val="0"/>
+          <w:sz w:val="22"/>
+          <w:szCs w:val="22"/>
+        </w:rPr>
+        <w:t>DMAI EMERGENCY BACKUP CODES</w:t>
+      </w:r>
+    </w:p>
+    <w:p>
+      <w:pPr>
+        <w:tabs>
+          <w:tab w:val="left" w:pos="560"/>
+          <w:tab w:val="left" w:pos="1120"/>
+          <w:tab w:val="left" w:pos="1680"/>
+          <w:tab w:val="left" w:pos="2240"/>
+          <w:tab w:val="left" w:pos="2800"/>
+          <w:tab w:val="left" w:pos="3360"/>
+          <w:tab w:val="left" w:pos="3920"/>
+          <w:tab w:val="left" w:pos="4480"/>
+          <w:tab w:val="left" w:pos="5040"/>
+          <w:tab w:val="left" w:pos="5600"/>
+          <w:tab w:val="left" w:pos="6160"/>
+          <w:tab w:val="left" w:pos="6720"/>
+        </w:tabs>
+        <w:autoSpaceDE w:val="0"/>
+        <w:autoSpaceDN w:val="0"/>
+        <w:adjustRightInd w:val="0"/>
+        <w:spacing w:after="0" w:line="240" w:lineRule="auto"/>
+        <w:rPr>
+          <w:rFonts w:ascii="Menlo" w:hAnsi="Menlo" w:cs="Menlo"/>
+          <w:color w:val="000000"/>
+          <w:kern w:val="0"/>
+          <w:sz w:val="22"/>
+          <w:szCs w:val="22"/>
+        </w:rPr>
+      </w:pPr>
+      <w:r>
+        <w:rPr>
+          <w:rFonts w:ascii="Menlo" w:hAnsi="Menlo" w:cs="Menlo"/>
+          <w:color w:val="000000"/>
+          <w:kern w:val="0"/>
+          <w:sz w:val="22"/>
+          <w:szCs w:val="22"/>
+        </w:rPr>
+        <w:t>==================================================</w:t>
+      </w:r>
+    </w:p>
+    <w:p>
+      <w:pPr>
+        <w:tabs>
+          <w:tab w:val="left" w:pos="560"/>
+          <w:tab w:val="left" w:pos="1120"/>
+          <w:tab w:val="left" w:pos="1680"/>
+          <w:tab w:val="left" w:pos="2240"/>
+          <w:tab w:val="left" w:pos="2800"/>
+          <w:tab w:val="left" w:pos="3360"/>
+          <w:tab w:val="left" w:pos="3920"/>
+          <w:tab w:val="left" w:pos="4480"/>
+          <w:tab w:val="left" w:pos="5040"/>
+          <w:tab w:val="left" w:pos="5600"/>
+          <w:tab w:val="left" w:pos="6160"/>
+          <w:tab w:val="left" w:pos="6720"/>
+        </w:tabs>
+        <w:autoSpaceDE w:val="0"/>
+        <w:autoSpaceDN w:val="0"/>
+        <w:adjustRightInd w:val="0"/>
+        <w:spacing w:after="0" w:line="240" w:lineRule="auto"/>
+        <w:rPr>
+          <w:rFonts w:ascii="Menlo" w:hAnsi="Menlo" w:cs="Menlo"/>
+          <w:color w:val="000000"/>
+          <w:kern w:val="0"/>
+          <w:sz w:val="22"/>
+          <w:szCs w:val="22"/>
+        </w:rPr>
+      </w:pPr>
+      <w:r>
+        <w:rPr>
+          <w:rFonts w:ascii="Menlo" w:hAnsi="Menlo" w:cs="Menlo"/>
+          <w:color w:val="000000"/>
+          <w:kern w:val="0"/>
+          <w:sz w:val="22"/>
+          <w:szCs w:val="22"/>
+        </w:rPr>
+        <w:t>Generated: 2026-03-06T09:21:24.435963</w:t>
+      </w:r>
+    </w:p>
+    <w:p>
+      <w:pPr>
+        <w:tabs>
+          <w:tab w:val="left" w:pos="560"/>
+          <w:tab w:val="left" w:pos="1120"/>
+          <w:tab w:val="left" w:pos="1680"/>
+          <w:tab w:val="left" w:pos="2240"/>
+          <w:tab w:val="left" w:pos="2800"/>
+          <w:tab w:val="left" w:pos="3360"/>
+          <w:tab w:val="left" w:pos="3920"/>
+          <w:tab w:val="left" w:pos="4480"/>
+          <w:tab w:val="left" w:pos="5040"/>
+          <w:tab w:val="left" w:pos="5600"/>
+          <w:tab w:val="left" w:pos="6160"/>
+          <w:tab w:val="left" w:pos="6720"/>
+        </w:tabs>
+        <w:autoSpaceDE w:val="0"/>
+        <w:autoSpaceDN w:val="0"/>
+        <w:adjustRightInd w:val="0"/>
+        <w:spacing w:after="0" w:line="240" w:lineRule="auto"/>
+        <w:rPr>
+          <w:rFonts w:ascii="Menlo" w:hAnsi="Menlo" w:cs="Menlo"/>
+          <w:color w:val="000000"/>
+          <w:kern w:val="0"/>
+          <w:sz w:val="22"/>
+          <w:szCs w:val="22"/>
+        </w:rPr>
+      </w:pPr>
+      <w:r>
+        <w:rPr>
+          <w:rFonts w:ascii="Menlo" w:hAnsi="Menlo" w:cs="Menlo"/>
+          <w:color w:val="000000"/>
+          <w:kern w:val="0"/>
+          <w:sz w:val="22"/>
+          <w:szCs w:val="22"/>
+        </w:rPr>
+        <w:t>Store these in a SAFE place!</w:t>
+      </w:r>
+    </w:p>
+    <w:p>
+      <w:pPr>
+        <w:tabs>
+          <w:tab w:val="left" w:pos="560"/>
+          <w:tab w:val="left" w:pos="1120"/>
+          <w:tab w:val="left" w:pos="1680"/>
+          <w:tab w:val="left" w:pos="2240"/>
+          <w:tab w:val="left" w:pos="2800"/>
+          <w:tab w:val="left" w:pos="3360"/>
+          <w:tab w:val="left" w:pos="3920"/>
+          <w:tab w:val="left" w:pos="4480"/>
+          <w:tab w:val="left" w:pos="5040"/>
+          <w:tab w:val="left" w:pos="5600"/>
+          <w:tab w:val="left" w:pos="6160"/>
+          <w:tab w:val="left" w:pos="6720"/>
+        </w:tabs>
+        <w:autoSpaceDE w:val="0"/>
+        <w:autoSpaceDN w:val="0"/>
+        <w:adjustRightInd w:val="0"/>
+        <w:spacing w:after="0" w:line="240" w:lineRule="auto"/>
+        <w:rPr>
+          <w:rFonts w:ascii="Menlo" w:hAnsi="Menlo" w:cs="Menlo"/>
+          <w:color w:val="000000"/>
+          <w:kern w:val="0"/>
+          <w:sz w:val="22"/>
+          <w:szCs w:val="22"/>
+        </w:rPr>
+      </w:pPr>
+      <w:r>
+        <w:rPr>
+          <w:rFonts w:ascii="Menlo" w:hAnsi="Menlo" w:cs="Menlo"/>
+          <w:color w:val="000000"/>
+          <w:kern w:val="0"/>
+          <w:sz w:val="22"/>
+          <w:szCs w:val="22"/>
+        </w:rPr>
+        <w:t>Each code can only be used once.</w:t>
+      </w:r>
+    </w:p>
+    <w:p>
+      <w:pPr>
+        <w:tabs>
+          <w:tab w:val="left" w:pos="560"/>
+          <w:tab w:val="left" w:pos="1120"/>
+          <w:tab w:val="left" w:pos="1680"/>
+          <w:tab w:val="left" w:pos="2240"/>
+          <w:tab w:val="left" w:pos="2800"/>
+          <w:tab w:val="left" w:pos="3360"/>
+          <w:tab w:val="left" w:pos="3920"/>
+          <w:tab w:val="left" w:pos="4480"/>
+          <w:tab w:val="left" w:pos="5040"/>
+          <w:tab w:val="left" w:pos="5600"/>
+          <w:tab w:val="left" w:pos="6160"/>
+          <w:tab w:val="left" w:pos="6720"/>
+        </w:tabs>
+        <w:autoSpaceDE w:val="0"/>
+        <w:autoSpaceDN w:val="0"/>
+        <w:adjustRightInd w:val="0"/>
+        <w:spacing w:after="0" w:line="240" w:lineRule="auto"/>
+        <w:rPr>
+          <w:rFonts w:ascii="Menlo" w:hAnsi="Menlo" w:cs="Menlo"/>
+          <w:color w:val="000000"/>
+          <w:kern w:val="0"/>
+          <w:sz w:val="22"/>
+          <w:szCs w:val="22"/>
+        </w:rPr>
+      </w:pPr>
+      <w:r>
+        <w:rPr>
+          <w:rFonts w:ascii="Menlo" w:hAnsi="Menlo" w:cs="Menlo"/>
+          <w:color w:val="000000"/>
+          <w:kern w:val="0"/>
+          <w:sz w:val="22"/>
+          <w:szCs w:val="22"/>
+        </w:rPr>
+        <w:t>==================================================</w:t>
+      </w:r>
+    </w:p>
+    <w:p>
+      <w:pPr>
+        <w:tabs>
+          <w:tab w:val="left" w:pos="560"/>
+          <w:tab w:val="left" w:pos="1120"/>
+          <w:tab w:val="left" w:pos="1680"/>
+          <w:tab w:val="left" w:pos="2240"/>
+          <w:tab w:val="left" w:pos="2800"/>
+          <w:tab w:val="left" w:pos="3360"/>
+          <w:tab w:val="left" w:pos="3920"/>
+          <w:tab w:val="left" w:pos="4480"/>
+          <w:tab w:val="left" w:pos="5040"/>
+          <w:tab w:val="left" w:pos="5600"/>
+          <w:tab w:val="left" w:pos="6160"/>
+          <w:tab w:val="left" w:pos="6720"/>
+        </w:tabs>
+        <w:autoSpaceDE w:val="0"/>
+        <w:autoSpaceDN w:val="0"/>
+        <w:adjustRightInd w:val="0"/>
+        <w:spacing w:after="0" w:line="240" w:lineRule="auto"/>
+        <w:rPr>
+          <w:rFonts w:ascii="Menlo" w:hAnsi="Menlo" w:cs="Menlo"/>
+          <w:color w:val="000000"/>
+          <w:kern w:val="0"/>
+          <w:sz w:val="22"/>
+          <w:szCs w:val="22"/>
+        </w:rPr>
+      </w:pPr>
+    </w:p>
+    <w:p>
+      <w:pPr>
+        <w:tabs>
+          <w:tab w:val="left" w:pos="560"/>
+          <w:tab w:val="left" w:pos="1120"/>
+          <w:tab w:val="left" w:pos="1680"/>
+          <w:tab w:val="left" w:pos="2240"/>
+          <w:tab w:val="left" w:pos="2800"/>
+          <w:tab w:val="left" w:pos="3360"/>
+          <w:tab w:val="left" w:pos="3920"/>
+          <w:tab w:val="left" w:pos="4480"/>
+          <w:tab w:val="left" w:pos="5040"/>
+          <w:tab w:val="left" w:pos="5600"/>
+          <w:tab w:val="left" w:pos="6160"/>
+          <w:tab w:val="left" w:pos="6720"/>
+        </w:tabs>
+        <w:autoSpaceDE w:val="0"/>
+        <w:autoSpaceDN w:val="0"/>
+        <w:adjustRightInd w:val="0"/>
+        <w:spacing w:after="0" w:line="240" w:lineRule="auto"/>
+        <w:rPr>
+          <w:rFonts w:ascii="Menlo" w:hAnsi="Menlo" w:cs="Menlo"/>
+          <w:color w:val="000000"/>
+          <w:kern w:val="0"/>
+          <w:sz w:val="22"/>
+          <w:szCs w:val="22"/>
+        </w:rPr>
+      </w:pPr>
+      <w:r>
+        <w:rPr>
+          <w:rFonts w:ascii="Menlo" w:hAnsi="Menlo" w:cs="Menlo"/>
+          <w:color w:val="000000"/>
+          <w:kern w:val="0"/>
+          <w:sz w:val="22"/>
+          <w:szCs w:val="22"/>
+        </w:rPr>
+        <w:t xml:space="preserve"> 1. 65F9566F</w:t>
+      </w:r>
+    </w:p>
+    <w:p>
+      <w:pPr>
+        <w:tabs>
+          <w:tab w:val="left" w:pos="560"/>
+          <w:tab w:val="left" w:pos="1120"/>
+          <w:tab w:val="left" w:pos="1680"/>
+          <w:tab w:val="left" w:pos="2240"/>
+          <w:tab w:val="left" w:pos="2800"/>
+          <w:tab w:val="left" w:pos="3360"/>
+          <w:tab w:val="left" w:pos="3920"/>
+          <w:tab w:val="left" w:pos="4480"/>
+          <w:tab w:val="left" w:pos="5040"/>
+          <w:tab w:val="left" w:pos="5600"/>
+          <w:tab w:val="left" w:pos="6160"/>
+          <w:tab w:val="left" w:pos="6720"/>
+        </w:tabs>
+        <w:autoSpaceDE w:val="0"/>
+        <w:autoSpaceDN w:val="0"/>
+        <w:adjustRightInd w:val="0"/>
+        <w:spacing w:after="0" w:line="240" w:lineRule="auto"/>
+        <w:rPr>
+          <w:rFonts w:ascii="Menlo" w:hAnsi="Menlo" w:cs="Menlo"/>
+          <w:color w:val="000000"/>
+          <w:kern w:val="0"/>
+          <w:sz w:val="22"/>
+          <w:szCs w:val="22"/>
+        </w:rPr>
+      </w:pPr>
+      <w:r>
+        <w:rPr>
+          <w:rFonts w:ascii="Menlo" w:hAnsi="Menlo" w:cs="Menlo"/>
+          <w:color w:val="000000"/>
+          <w:kern w:val="0"/>
+          <w:sz w:val="22"/>
+          <w:szCs w:val="22"/>
+        </w:rPr>
+        <w:t xml:space="preserve"> 2. 6DEA9730</w:t>
+      </w:r>
+    </w:p>
+    <w:p>
+      <w:pPr>
+        <w:tabs>
+          <w:tab w:val="left" w:pos="560"/>
+          <w:tab w:val="left" w:pos="1120"/>
+          <w:tab w:val="left" w:pos="1680"/>
+          <w:tab w:val="left" w:pos="2240"/>
+          <w:tab w:val="left" w:pos="2800"/>
+          <w:tab w:val="left" w:pos="3360"/>
+          <w:tab w:val="left" w:pos="3920"/>
+          <w:tab w:val="left" w:pos="4480"/>
+          <w:tab w:val="left" w:pos="5040"/>
+          <w:tab w:val="left" w:pos="5600"/>
+          <w:tab w:val="left" w:pos="6160"/>
+          <w:tab w:val="left" w:pos="6720"/>
+        </w:tabs>
+        <w:autoSpaceDE w:val="0"/>
+        <w:autoSpaceDN w:val="0"/>
+        <w:adjustRightInd w:val="0"/>
+        <w:spacing w:after="0" w:line="240" w:lineRule="auto"/>
+        <w:rPr>
+          <w:rFonts w:ascii="Menlo" w:hAnsi="Menlo" w:cs="Menlo"/>
+          <w:color w:val="000000"/>
+          <w:kern w:val="0"/>
+          <w:sz w:val="22"/>
+          <w:szCs w:val="22"/>
+        </w:rPr>
+      </w:pPr>
+      <w:r>
+        <w:rPr>
+          <w:rFonts w:ascii="Menlo" w:hAnsi="Menlo" w:cs="Menlo"/>
+          <w:color w:val="000000"/>
+          <w:kern w:val="0"/>
+          <w:sz w:val="22"/>
+          <w:szCs w:val="22"/>
+        </w:rPr>
+        <w:t xml:space="preserve"> 3. 03D7B654</w:t>
+      </w:r>
+    </w:p>
+    <w:p>
+      <w:pPr>
+        <w:tabs>
+          <w:tab w:val="left" w:pos="560"/>
+          <w:tab w:val="left" w:pos="1120"/>
+          <w:tab w:val="left" w:pos="1680"/>
+          <w:tab w:val="left" w:pos="2240"/>
+          <w:tab w:val="left" w:pos="2800"/>
+          <w:tab w:val="left" w:pos="3360"/>
+          <w:tab w:val="left" w:pos="3920"/>
+          <w:tab w:val="left" w:pos="4480"/>
+          <w:tab w:val="left" w:pos="5040"/>
+          <w:tab w:val="left" w:pos="5600"/>
+          <w:tab w:val="left" w:pos="6160"/>
+          <w:tab w:val="left" w:pos="6720"/>
+        </w:tabs>
+        <w:autoSpaceDE w:val="0"/>
+        <w:autoSpaceDN w:val="0"/>
+        <w:adjustRightInd w:val="0"/>
+        <w:spacing w:after="0" w:line="240" w:lineRule="auto"/>
+        <w:rPr>
+          <w:rFonts w:ascii="Menlo" w:hAnsi="Menlo" w:cs="Menlo"/>
+          <w:color w:val="000000"/>
+          <w:kern w:val="0"/>
+          <w:sz w:val="22"/>
+          <w:szCs w:val="22"/>
+        </w:rPr>
+      </w:pPr>
+      <w:r>
+        <w:rPr>
+          <w:rFonts w:ascii="Menlo" w:hAnsi="Menlo" w:cs="Menlo"/>
+          <w:color w:val="000000"/>
+          <w:kern w:val="0"/>
+          <w:sz w:val="22"/>
+          <w:szCs w:val="22"/>
+        </w:rPr>
+        <w:t xml:space="preserve"> 4. 6EAF6ABF</w:t>
+      </w:r>
+    </w:p>
+    <w:p>
+      <w:pPr>
+        <w:tabs>
+          <w:tab w:val="left" w:pos="560"/>
+          <w:tab w:val="left" w:pos="1120"/>
+          <w:tab w:val="left" w:pos="1680"/>
+          <w:tab w:val="left" w:pos="2240"/>
+          <w:tab w:val="left" w:pos="2800"/>
+          <w:tab w:val="left" w:pos="3360"/>
+          <w:tab w:val="left" w:pos="3920"/>
+          <w:tab w:val="left" w:pos="4480"/>
+          <w:tab w:val="left" w:pos="5040"/>
+          <w:tab w:val="left" w:pos="5600"/>
+          <w:tab w:val="left" w:pos="6160"/>
+          <w:tab w:val="left" w:pos="6720"/>
+        </w:tabs>
+        <w:autoSpaceDE w:val="0"/>
+        <w:autoSpaceDN w:val="0"/>
+        <w:adjustRightInd w:val="0"/>
+        <w:spacing w:after="0" w:line="240" w:lineRule="auto"/>
+        <w:rPr>
+          <w:rFonts w:ascii="Menlo" w:hAnsi="Menlo" w:cs="Menlo"/>
+          <w:color w:val="000000"/>
+          <w:kern w:val="0"/>
+          <w:sz w:val="22"/>
+          <w:szCs w:val="22"/>
+        </w:rPr>
+      </w:pPr>
+      <w:r>
+        <w:rPr>
+          <w:rFonts w:ascii="Menlo" w:hAnsi="Menlo" w:cs="Menlo"/>
+          <w:color w:val="000000"/>
+          <w:kern w:val="0"/>
+          <w:sz w:val="22"/>
+          <w:szCs w:val="22"/>
+        </w:rPr>
+        <w:t xml:space="preserve"> 5. 1CD619BE</w:t>
+      </w:r>
+    </w:p>
+    <w:p>
+      <w:pPr>
+        <w:tabs>
+          <w:tab w:val="left" w:pos="560"/>
+          <w:tab w:val="left" w:pos="1120"/>
+          <w:tab w:val="left" w:pos="1680"/>
+          <w:tab w:val="left" w:pos="2240"/>
+          <w:tab w:val="left" w:pos="2800"/>
+          <w:tab w:val="left" w:pos="3360"/>
+          <w:tab w:val="left" w:pos="3920"/>
+          <w:tab w:val="left" w:pos="4480"/>
+          <w:tab w:val="left" w:pos="5040"/>
+          <w:tab w:val="left" w:pos="5600"/>
+          <w:tab w:val="left" w:pos="6160"/>
+          <w:tab w:val="left" w:pos="6720"/>
+        </w:tabs>
+        <w:autoSpaceDE w:val="0"/>
+        <w:autoSpaceDN w:val="0"/>
+        <w:adjustRightInd w:val="0"/>
+        <w:spacing w:after="0" w:line="240" w:lineRule="auto"/>
+        <w:rPr>
+          <w:rFonts w:ascii="Menlo" w:hAnsi="Menlo" w:cs="Menlo"/>
+          <w:color w:val="000000"/>
+          <w:kern w:val="0"/>
+          <w:sz w:val="22"/>
+          <w:szCs w:val="22"/>
+        </w:rPr>
+      </w:pPr>
+      <w:r>
+        <w:rPr>
+          <w:rFonts w:ascii="Menlo" w:hAnsi="Menlo" w:cs="Menlo"/>
+          <w:color w:val="000000"/>
+          <w:kern w:val="0"/>
+          <w:sz w:val="22"/>
+          <w:szCs w:val="22"/>
+        </w:rPr>
+        <w:t xml:space="preserve"> 6. ECA66FB7</w:t>
+      </w:r>
+    </w:p>
+    <w:p>
+      <w:pPr>
+        <w:tabs>
+          <w:tab w:val="left" w:pos="560"/>
+          <w:tab w:val="left" w:pos="1120"/>
+          <w:tab w:val="left" w:pos="1680"/>
+          <w:tab w:val="left" w:pos="2240"/>
+          <w:tab w:val="left" w:pos="2800"/>
+          <w:tab w:val="left" w:pos="3360"/>
+          <w:tab w:val="left" w:pos="3920"/>
+          <w:tab w:val="left" w:pos="4480"/>
+          <w:tab w:val="left" w:pos="5040"/>
+          <w:tab w:val="left" w:pos="5600"/>
+          <w:tab w:val="left" w:pos="6160"/>
+          <w:tab w:val="left" w:pos="6720"/>
+        </w:tabs>
+        <w:autoSpaceDE w:val="0"/>
+        <w:autoSpaceDN w:val="0"/>
+        <w:adjustRightInd w:val="0"/>
+        <w:spacing w:after="0" w:line="240" w:lineRule="auto"/>
+        <w:rPr>
+          <w:rFonts w:ascii="Menlo" w:hAnsi="Menlo" w:cs="Menlo"/>
+          <w:color w:val="000000"/>
+          <w:kern w:val="0"/>
+          <w:sz w:val="22"/>
+          <w:szCs w:val="22"/>
+        </w:rPr>
+      </w:pPr>
+      <w:r>
+        <w:rPr>
+          <w:rFonts w:ascii="Menlo" w:hAnsi="Menlo" w:cs="Menlo"/>
+          <w:color w:val="000000"/>
+          <w:kern w:val="0"/>
+          <w:sz w:val="22"/>
+          <w:szCs w:val="22"/>
+        </w:rPr>
+        <w:t xml:space="preserve"> 7. C843F037</w:t>
+      </w:r>
+    </w:p>
+    <w:p>
+      <w:pPr>
+        <w:tabs>
+          <w:tab w:val="left" w:pos="560"/>
+          <w:tab w:val="left" w:pos="1120"/>
+          <w:tab w:val="left" w:pos="1680"/>
+          <w:tab w:val="left" w:pos="2240"/>
+          <w:tab w:val="left" w:pos="2800"/>
+          <w:tab w:val="left" w:pos="3360"/>
+          <w:tab w:val="left" w:pos="3920"/>
+          <w:tab w:val="left" w:pos="4480"/>
+          <w:tab w:val="left" w:pos="5040"/>
+          <w:tab w:val="left" w:pos="5600"/>
+          <w:tab w:val="left" w:pos="6160"/>
+          <w:tab w:val="left" w:pos="6720"/>
+        </w:tabs>
+        <w:autoSpaceDE w:val="0"/>
+        <w:autoSpaceDN w:val="0"/>
+        <w:adjustRightInd w:val="0"/>
+        <w:spacing w:after="0" w:line="240" w:lineRule="auto"/>
+        <w:rPr>
+          <w:rFonts w:ascii="Menlo" w:hAnsi="Menlo" w:cs="Menlo"/>
+          <w:color w:val="000000"/>
+          <w:kern w:val="0"/>
+          <w:sz w:val="22"/>
+          <w:szCs w:val="22"/>
+        </w:rPr>
+      </w:pPr>
+      <w:r>
+        <w:rPr>
+          <w:rFonts w:ascii="Menlo" w:hAnsi="Menlo" w:cs="Menlo"/>
+          <w:color w:val="000000"/>
+          <w:kern w:val="0"/>
+          <w:sz w:val="22"/>
+          <w:szCs w:val="22"/>
+        </w:rPr>
+        <w:t xml:space="preserve"> 8. 08FCA129</w:t>
+      </w:r>
+    </w:p>
+    <w:p>
+      <w:pPr>
+        <w:tabs>
+          <w:tab w:val="left" w:pos="560"/>
+          <w:tab w:val="left" w:pos="1120"/>
+          <w:tab w:val="left" w:pos="1680"/>
+          <w:tab w:val="left" w:pos="2240"/>
+          <w:tab w:val="left" w:pos="2800"/>
+          <w:tab w:val="left" w:pos="3360"/>
+          <w:tab w:val="left" w:pos="3920"/>
+          <w:tab w:val="left" w:pos="4480"/>
+          <w:tab w:val="left" w:pos="5040"/>
+          <w:tab w:val="left" w:pos="5600"/>
+          <w:tab w:val="left" w:pos="6160"/>
+          <w:tab w:val="left" w:pos="6720"/>
+        </w:tabs>
+        <w:autoSpaceDE w:val="0"/>
+        <w:autoSpaceDN w:val="0"/>
+        <w:adjustRightInd w:val="0"/>
+        <w:spacing w:after="0" w:line="240" w:lineRule="auto"/>
+        <w:rPr>
+          <w:rFonts w:ascii="Menlo" w:hAnsi="Menlo" w:cs="Menlo"/>
+          <w:color w:val="000000"/>
+          <w:kern w:val="0"/>
+          <w:sz w:val="22"/>
+          <w:szCs w:val="22"/>
+        </w:rPr>
+      </w:pPr>
+      <w:r>
+        <w:rPr>
+          <w:rFonts w:ascii="Menlo" w:hAnsi="Menlo" w:cs="Menlo"/>
+          <w:color w:val="000000"/>
+          <w:kern w:val="0"/>
+          <w:sz w:val="22"/>
+          <w:szCs w:val="22"/>
+        </w:rPr>
+        <w:t xml:space="preserve"> 9. FCC33E01</w:t>
+      </w:r>
+    </w:p>
+    <w:p>
+      <w:pPr>
+        <w:tabs>
+          <w:tab w:val="left" w:pos="560"/>
+          <w:tab w:val="left" w:pos="1120"/>
+          <w:tab w:val="left" w:pos="1680"/>
+          <w:tab w:val="left" w:pos="2240"/>
+          <w:tab w:val="left" w:pos="2800"/>
+          <w:tab w:val="left" w:pos="3360"/>
+          <w:tab w:val="left" w:pos="3920"/>
+          <w:tab w:val="left" w:pos="4480"/>
+          <w:tab w:val="left" w:pos="5040"/>
+          <w:tab w:val="left" w:pos="5600"/>
+          <w:tab w:val="left" w:pos="6160"/>
+          <w:tab w:val="left" w:pos="6720"/>
+        </w:tabs>
+        <w:autoSpaceDE w:val="0"/>
+        <w:autoSpaceDN w:val="0"/>
+        <w:adjustRightInd w:val="0"/>
+        <w:spacing w:after="0" w:line="240" w:lineRule="auto"/>
+        <w:rPr>
+          <w:rFonts w:ascii="Menlo" w:hAnsi="Menlo" w:cs="Menlo"/>
+          <w:color w:val="000000"/>
+          <w:kern w:val="0"/>
+          <w:sz w:val="22"/>
+          <w:szCs w:val="22"/>
+        </w:rPr>
+      </w:pPr>
+      <w:r>
+        <w:rPr>
+          <w:rFonts w:ascii="Menlo" w:hAnsi="Menlo" w:cs="Menlo"/>
+          <w:color w:val="000000"/>
+          <w:kern w:val="0"/>
+          <w:sz w:val="22"/>
+          <w:szCs w:val="22"/>
+        </w:rPr>
+        <w:t>10. ACD6D55C</w:t>
+      </w:r>
+    </w:p>
+    <w:p>
+      <w:pPr>
+        <w:tabs>
+          <w:tab w:val="left" w:pos="560"/>
+          <w:tab w:val="left" w:pos="1120"/>
+          <w:tab w:val="left" w:pos="1680"/>
+          <w:tab w:val="left" w:pos="2240"/>
+          <w:tab w:val="left" w:pos="2800"/>
+          <w:tab w:val="left" w:pos="3360"/>
+          <w:tab w:val="left" w:pos="3920"/>
+          <w:tab w:val="left" w:pos="4480"/>
+          <w:tab w:val="left" w:pos="5040"/>
+          <w:tab w:val="left" w:pos="5600"/>
+          <w:tab w:val="left" w:pos="6160"/>
+          <w:tab w:val="left" w:pos="6720"/>
+        </w:tabs>
+        <w:autoSpaceDE w:val="0"/>
+        <w:autoSpaceDN w:val="0"/>
+        <w:adjustRightInd w:val="0"/>
+        <w:spacing w:after="0" w:line="240" w:lineRule="auto"/>
+        <w:rPr>
+          <w:rFonts w:ascii="Menlo" w:hAnsi="Menlo" w:cs="Menlo"/>
+          <w:color w:val="000000"/>
+          <w:kern w:val="0"/>
+          <w:sz w:val="22"/>
+          <w:szCs w:val="22"/>
+        </w:rPr>
+      </w:pPr>
+    </w:p>
+    <w:p>
+      <w:pPr>
+        <w:tabs>
+          <w:tab w:val="left" w:pos="560"/>
+          <w:tab w:val="left" w:pos="1120"/>
+          <w:tab w:val="left" w:pos="1680"/>
+          <w:tab w:val="left" w:pos="2240"/>
+          <w:tab w:val="left" w:pos="2800"/>
+          <w:tab w:val="left" w:pos="3360"/>
+          <w:tab w:val="left" w:pos="3920"/>
+          <w:tab w:val="left" w:pos="4480"/>
+          <w:tab w:val="left" w:pos="5040"/>
+          <w:tab w:val="left" w:pos="5600"/>
+          <w:tab w:val="left" w:pos="6160"/>
+          <w:tab w:val="left" w:pos="6720"/>
+        </w:tabs>
+        <w:autoSpaceDE w:val="0"/>
+        <w:autoSpaceDN w:val="0"/>
+        <w:adjustRightInd w:val="0"/>
+        <w:spacing w:after="0" w:line="240" w:lineRule="auto"/>
+        <w:rPr>
+          <w:rFonts w:ascii="Menlo" w:hAnsi="Menlo" w:cs="Menlo"/>
+          <w:color w:val="000000"/>
+          <w:kern w:val="0"/>
+          <w:sz w:val="22"/>
+          <w:szCs w:val="22"/>
+        </w:rPr>
+      </w:pPr>
+      <w:r>
+        <w:rPr>
+          <w:rFonts w:ascii="Menlo" w:hAnsi="Menlo" w:cs="Menlo"/>
+          <w:color w:val="000000"/>
+          <w:kern w:val="0"/>
+          <w:sz w:val="22"/>
+          <w:szCs w:val="22"/>
+        </w:rPr>
+        <w:t>==================================================</w:t>
+      </w:r>
+    </w:p>
+    <w:p>
+      <w:r>
+        <w:rPr>
+          <w:rFonts w:ascii="Menlo" w:hAnsi="Menlo" w:cs="Menlo"/>
+          <w:color w:val="000000"/>
+          <w:kern w:val="0"/>
+          <w:sz w:val="22"/>
+          <w:szCs w:val="22"/>
+        </w:rPr>
+        <w:t>KEEP THIS FILE SECURE!</w:t>
+      </w:r>
+    </w:p>
     <w:sectPr>
-      <w:footerReference w:type="even" r:id="rId6"/>
-      <w:footerReference w:type="default" r:id="rId7"/>
+      <w:footerReference w:type="even" r:id="rId7"/>
       <w:footerReference w:type="first" r:id="rId8"/>
       <w:pgSz w:w="11906" w:h="16838"/>
       <w:pgMar w:top="1440" w:right="1440" w:bottom="1440" w:left="1440" w:header="708" w:footer="708" w:gutter="0"/>
@@ -2662,7 +5841,6 @@
               <v:path gradientshapeok="t" o:connecttype="rect"/>
             </v:shapetype>
             <v:shape id="Text Box 2" o:spid="_x0000_s1026" type="#_x0000_t202" alt="Saipem Classification - General Use" style="position:absolute;margin-left:0;margin-top:0;width:127pt;height:25.75pt;z-index:251659264;visibility:visible;mso-wrap-style:none;mso-wrap-distance-left:0;mso-wrap-distance-top:0;mso-wrap-distance-right:0;mso-wrap-distance-bottom:0;mso-position-horizontal:center;mso-position-horizontal-relative:page;mso-position-vertical:bottom;mso-position-vertical-relative:page;v-text-anchor:bottom" o:gfxdata="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" filled="f" stroked="f">
-              <v:fill o:detectmouseclick="t"/>
               <v:textbox style="mso-fit-shape-to-text:t" inset="0,0,0,15pt">
                 <w:txbxContent>
                   <w:p>
@@ -2700,137 +5878,6 @@
 </file>
 
 <file path=word/footer2.xml><?xml version="1.0" encoding="utf-8"?>
-<w:ftr xmlns:wpc="http://schemas.microsoft.com/office/word/2010/wordprocessingCanvas" xmlns:cx="http://schemas.microsoft.com/office/drawing/2014/chartex" xmlns:cx1="http://schemas.microsoft.com/office/drawing/2015/9/8/chartex" xmlns:cx2="http://schemas.microsoft.com/office/drawing/2015/10/21/chartex" xmlns:cx3="http://schemas.microsoft.com/office/drawing/2016/5/9/chartex" xmlns:cx4="http://schemas.microsoft.com/office/drawing/2016/5/10/chartex" xmlns:cx5="http://schemas.microsoft.com/office/drawing/2016/5/11/chartex" xmlns:cx6="http://schemas.microsoft.com/office/drawing/2016/5/12/chartex" xmlns:cx7="http://schemas.microsoft.com/office/drawing/2016/5/13/chartex" xmlns:cx8="http://schemas.microsoft.com/office/drawing/2016/5/14/chartex" xmlns:mc="http://schemas.openxmlformats.org/markup-compatibility/2006" xmlns:aink="http://schemas.microsoft.com/office/drawing/2016/ink" xmlns:am3d="http://schemas.microsoft.com/office/drawing/2017/model3d" xmlns:o="urn:schemas-microsoft-com:office:office" xmlns:oel="http://schemas.microsoft.com/office/2019/extlst" xmlns:r="http://schemas.openxmlformats.org/officeDocument/2006/relationships" xmlns:m="http://schemas.openxmlformats.org/officeDocument/2006/math" xmlns:v="urn:schemas-microsoft-com:vml" xmlns:wp14="http://schemas.microsoft.com/office/word/2010/wordprocessingDrawing" xmlns:wp="http://schemas.openxmlformats.org/drawingml/2006/wordprocessingDrawing" xmlns:w10="urn:schemas-microsoft-com:office:word" xmlns:w="http://schemas.openxmlformats.org/wordprocessingml/2006/main" xmlns:w14="http://schemas.microsoft.com/office/word/2010/wordml" xmlns:w15="http://schemas.microsoft.com/office/word/2012/wordml" xmlns:w16cex="http://schemas.microsoft.com/office/word/2018/wordml/cex" xmlns:w16cid="http://schemas.microsoft.com/office/word/2016/wordml/cid" xmlns:w16="http://schemas.microsoft.com/office/word/2018/wordml" xmlns:w16du="http://schemas.microsoft.com/office/word/2023/wordml/word16du" xmlns:w16sdtdh="http://schemas.microsoft.com/office/word/2020/wordml/sdtdatahash" xmlns:w16sdtfl="http://schemas.microsoft.com/office/word/2024/wordml/sdtformatlock" xmlns:w16se="http://schemas.microsoft.com/office/word/2015/wordml/symex" xmlns:wpg="http://schemas.microsoft.com/office/word/2010/wordprocessingGroup" xmlns:wpi="http://schemas.microsoft.com/office/word/2010/wordprocessingInk" xmlns:wne="http://schemas.microsoft.com/office/word/2006/wordml" xmlns:wps="http://schemas.microsoft.com/office/word/2010/wordprocessingShape" mc:Ignorable="w14 w15 w16se w16cid w16 w16cex w16sdtdh w16sdtfl w16du wp14">
-  <w:p>
-    <w:pPr>
-      <w:pStyle w:val="Footer"/>
-    </w:pPr>
-    <w:r>
-      <w:rPr>
-        <w:noProof/>
-      </w:rPr>
-      <mc:AlternateContent>
-        <mc:Choice Requires="wps">
-          <w:drawing>
-            <wp:anchor distT="0" distB="0" distL="0" distR="0" simplePos="0" relativeHeight="251660288" behindDoc="0" locked="0" layoutInCell="1" allowOverlap="1" wp14:anchorId="0D5CBC51" wp14:editId="0D26DFEC">
-              <wp:simplePos x="0" y="0"/>
-              <wp:positionH relativeFrom="page">
-                <wp:align>center</wp:align>
-              </wp:positionH>
-              <wp:positionV relativeFrom="page">
-                <wp:align>bottom</wp:align>
-              </wp:positionV>
-              <wp:extent cx="1612900" cy="327025"/>
-              <wp:effectExtent l="0" t="0" r="0" b="0"/>
-              <wp:wrapNone/>
-              <wp:docPr id="575098681" name="Text Box 3" descr="Saipem Classification - General Use">
-                <a:extLst xmlns:a="http://schemas.openxmlformats.org/drawingml/2006/main">
-                  <a:ext uri="{5AE41FA2-C0FF-4470-9BD4-5FADCA87CBE2}">
-                    <aclsh:classification xmlns:aclsh="http://schemas.microsoft.com/office/drawing/2020/classificationShape" classificationOutcomeType="ftr"/>
-                  </a:ext>
-                </a:extLst>
-              </wp:docPr>
-              <wp:cNvGraphicFramePr/>
-              <a:graphic xmlns:a="http://schemas.openxmlformats.org/drawingml/2006/main">
-                <a:graphicData uri="http://schemas.microsoft.com/office/word/2010/wordprocessingShape">
-                  <wps:wsp>
-                    <wps:cNvSpPr txBox="1"/>
-                    <wps:spPr>
-                      <a:xfrm>
-                        <a:off x="0" y="0"/>
-                        <a:ext cx="1612900" cy="327025"/>
-                      </a:xfrm>
-                      <a:prstGeom prst="rect">
-                        <a:avLst/>
-                      </a:prstGeom>
-                      <a:noFill/>
-                      <a:ln>
-                        <a:noFill/>
-                      </a:ln>
-                    </wps:spPr>
-                    <wps:txbx>
-                      <w:txbxContent>
-                        <w:p>
-                          <w:pPr>
-                            <w:spacing w:after="0"/>
-                            <w:rPr>
-                              <w:rFonts w:ascii="Trebuchet MS" w:eastAsia="Trebuchet MS" w:hAnsi="Trebuchet MS" w:cs="Trebuchet MS"/>
-                              <w:noProof/>
-                              <w:color w:val="22505F"/>
-                              <w:sz w:val="16"/>
-                              <w:szCs w:val="16"/>
-                            </w:rPr>
-                          </w:pPr>
-                          <w:r>
-                            <w:rPr>
-                              <w:rFonts w:ascii="Trebuchet MS" w:eastAsia="Trebuchet MS" w:hAnsi="Trebuchet MS" w:cs="Trebuchet MS"/>
-                              <w:noProof/>
-                              <w:color w:val="22505F"/>
-                              <w:sz w:val="16"/>
-                              <w:szCs w:val="16"/>
-                            </w:rPr>
-                            <w:t>Saipem Classification - General Use</w:t>
-                          </w:r>
-                        </w:p>
-                      </w:txbxContent>
-                    </wps:txbx>
-                    <wps:bodyPr rot="0" spcFirstLastPara="0" vertOverflow="overflow" horzOverflow="overflow" vert="horz" wrap="none" lIns="0" tIns="0" rIns="0" bIns="190500" numCol="1" spcCol="0" rtlCol="0" fromWordArt="0" anchor="b" anchorCtr="0" forceAA="0" compatLnSpc="1">
-                      <a:prstTxWarp prst="textNoShape">
-                        <a:avLst/>
-                      </a:prstTxWarp>
-                      <a:spAutoFit/>
-                    </wps:bodyPr>
-                  </wps:wsp>
-                </a:graphicData>
-              </a:graphic>
-            </wp:anchor>
-          </w:drawing>
-        </mc:Choice>
-        <mc:Fallback>
-          <w:pict>
-            <v:shapetype w14:anchorId="0D5CBC51" id="_x0000_t202" coordsize="21600,21600" o:spt="202" path="m,l,21600r21600,l21600,xe">
-              <v:stroke joinstyle="miter"/>
-              <v:path gradientshapeok="t" o:connecttype="rect"/>
-            </v:shapetype>
-            <v:shape id="Text Box 3" o:spid="_x0000_s1027" type="#_x0000_t202" alt="Saipem Classification - General Use" style="position:absolute;margin-left:0;margin-top:0;width:127pt;height:25.75pt;z-index:251660288;visibility:visible;mso-wrap-style:none;mso-wrap-distance-left:0;mso-wrap-distance-top:0;mso-wrap-distance-right:0;mso-wrap-distance-bottom:0;mso-position-horizontal:center;mso-position-horizontal-relative:page;mso-position-vertical:bottom;mso-position-vertical-relative:page;v-text-anchor:bottom" o:gfxdata="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" filled="f" stroked="f">
-              <v:fill o:detectmouseclick="t"/>
-              <v:textbox style="mso-fit-shape-to-text:t" inset="0,0,0,15pt">
-                <w:txbxContent>
-                  <w:p>
-                    <w:pPr>
-                      <w:spacing w:after="0"/>
-                      <w:rPr>
-                        <w:rFonts w:ascii="Trebuchet MS" w:eastAsia="Trebuchet MS" w:hAnsi="Trebuchet MS" w:cs="Trebuchet MS"/>
-                        <w:noProof/>
-                        <w:color w:val="22505F"/>
-                        <w:sz w:val="16"/>
-                        <w:szCs w:val="16"/>
-                      </w:rPr>
-                    </w:pPr>
-                    <w:r>
-                      <w:rPr>
-                        <w:rFonts w:ascii="Trebuchet MS" w:eastAsia="Trebuchet MS" w:hAnsi="Trebuchet MS" w:cs="Trebuchet MS"/>
-                        <w:noProof/>
-                        <w:color w:val="22505F"/>
-                        <w:sz w:val="16"/>
-                        <w:szCs w:val="16"/>
-                      </w:rPr>
-                      <w:t>Saipem Classification - General Use</w:t>
-                    </w:r>
-                  </w:p>
-                </w:txbxContent>
-              </v:textbox>
-              <w10:wrap anchorx="page" anchory="page"/>
-            </v:shape>
-          </w:pict>
-        </mc:Fallback>
-      </mc:AlternateContent>
-    </w:r>
-  </w:p>
-</w:ftr>
-</file>
-
-<file path=word/footer3.xml><?xml version="1.0" encoding="utf-8"?>
 <w:ftr xmlns:wpc="http://schemas.microsoft.com/office/word/2010/wordprocessingCanvas" xmlns:cx="http://schemas.microsoft.com/office/drawing/2014/chartex" xmlns:cx1="http://schemas.microsoft.com/office/drawing/2015/9/8/chartex" xmlns:cx2="http://schemas.microsoft.com/office/drawing/2015/10/21/chartex" xmlns:cx3="http://schemas.microsoft.com/office/drawing/2016/5/9/chartex" xmlns:cx4="http://schemas.microsoft.com/office/drawing/2016/5/10/chartex" xmlns:cx5="http://schemas.microsoft.com/office/drawing/2016/5/11/chartex" xmlns:cx6="http://schemas.microsoft.com/office/drawing/2016/5/12/chartex" xmlns:cx7="http://schemas.microsoft.com/office/drawing/2016/5/13/chartex" xmlns:cx8="http://schemas.microsoft.com/office/drawing/2016/5/14/chartex" xmlns:mc="http://schemas.openxmlformats.org/markup-compatibility/2006" xmlns:aink="http://schemas.microsoft.com/office/drawing/2016/ink" xmlns:am3d="http://schemas.microsoft.com/office/drawing/2017/model3d" xmlns:o="urn:schemas-microsoft-com:office:office" xmlns:oel="http://schemas.microsoft.com/office/2019/extlst" xmlns:r="http://schemas.openxmlformats.org/officeDocument/2006/relationships" xmlns:m="http://schemas.openxmlformats.org/officeDocument/2006/math" xmlns:v="urn:schemas-microsoft-com:vml" xmlns:wp14="http://schemas.microsoft.com/office/word/2010/wordprocessingDrawing" xmlns:wp="http://schemas.openxmlformats.org/drawingml/2006/wordprocessingDrawing" xmlns:w10="urn:schemas-microsoft-com:office:word" xmlns:w="http://schemas.openxmlformats.org/wordprocessingml/2006/main" xmlns:w14="http://schemas.microsoft.com/office/word/2010/wordml" xmlns:w15="http://schemas.microsoft.com/office/word/2012/wordml" xmlns:w16cex="http://schemas.microsoft.com/office/word/2018/wordml/cex" xmlns:w16cid="http://schemas.microsoft.com/office/word/2016/wordml/cid" xmlns:w16="http://schemas.microsoft.com/office/word/2018/wordml" xmlns:w16du="http://schemas.microsoft.com/office/word/2023/wordml/word16du" xmlns:w16sdtdh="http://schemas.microsoft.com/office/word/2020/wordml/sdtdatahash" xmlns:w16sdtfl="http://schemas.microsoft.com/office/word/2024/wordml/sdtformatlock" xmlns:w16se="http://schemas.microsoft.com/office/word/2015/wordml/symex" xmlns:wpg="http://schemas.microsoft.com/office/word/2010/wordprocessingGroup" xmlns:wpi="http://schemas.microsoft.com/office/word/2010/wordprocessingInk" xmlns:wne="http://schemas.microsoft.com/office/word/2006/wordml" xmlns:wps="http://schemas.microsoft.com/office/word/2010/wordprocessingShape" mc:Ignorable="w14 w15 w16se w16cid w16 w16cex w16sdtdh w16sdtfl w16du wp14">
   <w:p>
     <w:pPr>
@@ -2923,8 +5970,7 @@
               <v:stroke joinstyle="miter"/>
               <v:path gradientshapeok="t" o:connecttype="rect"/>
             </v:shapetype>
-            <v:shape id="Text Box 1" o:spid="_x0000_s1028" type="#_x0000_t202" alt="Saipem Classification - General Use" style="position:absolute;margin-left:0;margin-top:0;width:127pt;height:25.75pt;z-index:251658240;visibility:visible;mso-wrap-style:none;mso-wrap-distance-left:0;mso-wrap-distance-top:0;mso-wrap-distance-right:0;mso-wrap-distance-bottom:0;mso-position-horizontal:center;mso-position-horizontal-relative:page;mso-position-vertical:bottom;mso-position-vertical-relative:page;v-text-anchor:bottom" o:gfxdata="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" filled="f" stroked="f">
-              <v:fill o:detectmouseclick="t"/>
+            <v:shape id="Text Box 1" o:spid="_x0000_s1027" type="#_x0000_t202" alt="Saipem Classification - General Use" style="position:absolute;margin-left:0;margin-top:0;width:127pt;height:25.75pt;z-index:251658240;visibility:visible;mso-wrap-style:none;mso-wrap-distance-left:0;mso-wrap-distance-top:0;mso-wrap-distance-right:0;mso-wrap-distance-bottom:0;mso-position-horizontal:center;mso-position-horizontal-relative:page;mso-position-vertical:bottom;mso-position-vertical-relative:page;v-text-anchor:bottom" o:gfxdata="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" filled="f" stroked="f">
               <v:textbox style="mso-fit-shape-to-text:t" inset="0,0,0,15pt">
                 <w:txbxContent>
                   <w:p>
@@ -2984,6 +6030,127 @@
     </w:p>
   </w:footnote>
 </w:footnotes>
+</file>
+
+<file path=word/numbering.xml><?xml version="1.0" encoding="utf-8"?>
+<w:numbering xmlns:wpc="http://schemas.microsoft.com/office/word/2010/wordprocessingCanvas" xmlns:cx="http://schemas.microsoft.com/office/drawing/2014/chartex" xmlns:cx1="http://schemas.microsoft.com/office/drawing/2015/9/8/chartex" xmlns:cx2="http://schemas.microsoft.com/office/drawing/2015/10/21/chartex" xmlns:cx3="http://schemas.microsoft.com/office/drawing/2016/5/9/chartex" xmlns:cx4="http://schemas.microsoft.com/office/drawing/2016/5/10/chartex" xmlns:cx5="http://schemas.microsoft.com/office/drawing/2016/5/11/chartex" xmlns:cx6="http://schemas.microsoft.com/office/drawing/2016/5/12/chartex" xmlns:cx7="http://schemas.microsoft.com/office/drawing/2016/5/13/chartex" xmlns:cx8="http://schemas.microsoft.com/office/drawing/2016/5/14/chartex" xmlns:mc="http://schemas.openxmlformats.org/markup-compatibility/2006" xmlns:aink="http://schemas.microsoft.com/office/drawing/2016/ink" xmlns:am3d="http://schemas.microsoft.com/office/drawing/2017/model3d" xmlns:o="urn:schemas-microsoft-com:office:office" xmlns:oel="http://schemas.microsoft.com/office/2019/extlst" xmlns:r="http://schemas.openxmlformats.org/officeDocument/2006/relationships" xmlns:m="http://schemas.openxmlformats.org/officeDocument/2006/math" xmlns:v="urn:schemas-microsoft-com:vml" xmlns:wp14="http://schemas.microsoft.com/office/word/2010/wordprocessingDrawing" xmlns:wp="http://schemas.openxmlformats.org/drawingml/2006/wordprocessingDrawing" xmlns:w10="urn:schemas-microsoft-com:office:word" xmlns:w="http://schemas.openxmlformats.org/wordprocessingml/2006/main" xmlns:w14="http://schemas.microsoft.com/office/word/2010/wordml" xmlns:w15="http://schemas.microsoft.com/office/word/2012/wordml" xmlns:w16cex="http://schemas.microsoft.com/office/word/2018/wordml/cex" xmlns:w16cid="http://schemas.microsoft.com/office/word/2016/wordml/cid" xmlns:w16="http://schemas.microsoft.com/office/word/2018/wordml" xmlns:w16du="http://schemas.microsoft.com/office/word/2023/wordml/word16du" xmlns:w16sdtdh="http://schemas.microsoft.com/office/word/2020/wordml/sdtdatahash" xmlns:w16sdtfl="http://schemas.microsoft.com/office/word/2024/wordml/sdtformatlock" xmlns:w16se="http://schemas.microsoft.com/office/word/2015/wordml/symex" xmlns:wpg="http://schemas.microsoft.com/office/word/2010/wordprocessingGroup" xmlns:wpi="http://schemas.microsoft.com/office/word/2010/wordprocessingInk" xmlns:wne="http://schemas.microsoft.com/office/word/2006/wordml" xmlns:wps="http://schemas.microsoft.com/office/word/2010/wordprocessingShape" mc:Ignorable="w14 w15 w16se w16cid w16 w16cex w16sdtdh w16sdtfl w16du wp14">
+  <w:abstractNum w:abstractNumId="0" w15:restartNumberingAfterBreak="0">
+    <w:nsid w:val="58B43DA7"/>
+    <w:multiLevelType w:val="multilevel"/>
+    <w:tmpl w:val="D90E9778"/>
+    <w:lvl w:ilvl="0">
+      <w:start w:val="1"/>
+      <w:numFmt w:val="decimal"/>
+      <w:lvlText w:val="%1."/>
+      <w:lvlJc w:val="left"/>
+      <w:pPr>
+        <w:tabs>
+          <w:tab w:val="num" w:pos="720"/>
+        </w:tabs>
+        <w:ind w:left="720" w:hanging="360"/>
+      </w:pPr>
+    </w:lvl>
+    <w:lvl w:ilvl="1" w:tentative="1">
+      <w:start w:val="1"/>
+      <w:numFmt w:val="decimal"/>
+      <w:lvlText w:val="%2."/>
+      <w:lvlJc w:val="left"/>
+      <w:pPr>
+        <w:tabs>
+          <w:tab w:val="num" w:pos="1440"/>
+        </w:tabs>
+        <w:ind w:left="1440" w:hanging="360"/>
+      </w:pPr>
+    </w:lvl>
+    <w:lvl w:ilvl="2" w:tentative="1">
+      <w:start w:val="1"/>
+      <w:numFmt w:val="decimal"/>
+      <w:lvlText w:val="%3."/>
+      <w:lvlJc w:val="left"/>
+      <w:pPr>
+        <w:tabs>
+          <w:tab w:val="num" w:pos="2160"/>
+        </w:tabs>
+        <w:ind w:left="2160" w:hanging="360"/>
+      </w:pPr>
+    </w:lvl>
+    <w:lvl w:ilvl="3" w:tentative="1">
+      <w:start w:val="1"/>
+      <w:numFmt w:val="decimal"/>
+      <w:lvlText w:val="%4."/>
+      <w:lvlJc w:val="left"/>
+      <w:pPr>
+        <w:tabs>
+          <w:tab w:val="num" w:pos="2880"/>
+        </w:tabs>
+        <w:ind w:left="2880" w:hanging="360"/>
+      </w:pPr>
+    </w:lvl>
+    <w:lvl w:ilvl="4" w:tentative="1">
+      <w:start w:val="1"/>
+      <w:numFmt w:val="decimal"/>
+      <w:lvlText w:val="%5."/>
+      <w:lvlJc w:val="left"/>
+      <w:pPr>
+        <w:tabs>
+          <w:tab w:val="num" w:pos="3600"/>
+        </w:tabs>
+        <w:ind w:left="3600" w:hanging="360"/>
+      </w:pPr>
+    </w:lvl>
+    <w:lvl w:ilvl="5" w:tentative="1">
+      <w:start w:val="1"/>
+      <w:numFmt w:val="decimal"/>
+      <w:lvlText w:val="%6."/>
+      <w:lvlJc w:val="left"/>
+      <w:pPr>
+        <w:tabs>
+          <w:tab w:val="num" w:pos="4320"/>
+        </w:tabs>
+        <w:ind w:left="4320" w:hanging="360"/>
+      </w:pPr>
+    </w:lvl>
+    <w:lvl w:ilvl="6" w:tentative="1">
+      <w:start w:val="1"/>
+      <w:numFmt w:val="decimal"/>
+      <w:lvlText w:val="%7."/>
+      <w:lvlJc w:val="left"/>
+      <w:pPr>
+        <w:tabs>
+          <w:tab w:val="num" w:pos="5040"/>
+        </w:tabs>
+        <w:ind w:left="5040" w:hanging="360"/>
+      </w:pPr>
+    </w:lvl>
+    <w:lvl w:ilvl="7" w:tentative="1">
+      <w:start w:val="1"/>
+      <w:numFmt w:val="decimal"/>
+      <w:lvlText w:val="%8."/>
+      <w:lvlJc w:val="left"/>
+      <w:pPr>
+        <w:tabs>
+          <w:tab w:val="num" w:pos="5760"/>
+        </w:tabs>
+        <w:ind w:left="5760" w:hanging="360"/>
+      </w:pPr>
+    </w:lvl>
+    <w:lvl w:ilvl="8" w:tentative="1">
+      <w:start w:val="1"/>
+      <w:numFmt w:val="decimal"/>
+      <w:lvlText w:val="%9."/>
+      <w:lvlJc w:val="left"/>
+      <w:pPr>
+        <w:tabs>
+          <w:tab w:val="num" w:pos="6480"/>
+        </w:tabs>
+        <w:ind w:left="6480" w:hanging="360"/>
+      </w:pPr>
+    </w:lvl>
+  </w:abstractNum>
+  <w:num w:numId="1" w16cid:durableId="528032841">
+    <w:abstractNumId w:val="0"/>
+  </w:num>
+</w:numbering>
 </file>
 
 <file path=word/styles.xml><?xml version="1.0" encoding="utf-8"?>
@@ -3934,6 +7101,117 @@
       <w:szCs w:val="20"/>
     </w:rPr>
   </w:style>
+  <w:style w:type="character" w:styleId="Strong">
+    <w:name w:val="Strong"/>
+    <w:basedOn w:val="DefaultParagraphFont"/>
+    <w:uiPriority w:val="22"/>
+    <w:qFormat/>
+    <w:rsid w:val="00BF720B"/>
+    <w:rPr>
+      <w:b/>
+      <w:bCs/>
+    </w:rPr>
+  </w:style>
+  <w:style w:type="paragraph" w:customStyle="1" w:styleId="ds-markdown-paragraph">
+    <w:name w:val="ds-markdown-paragraph"/>
+    <w:basedOn w:val="Normal"/>
+    <w:rsid w:val="00BF720B"/>
+    <w:pPr>
+      <w:spacing w:before="100" w:beforeAutospacing="1" w:after="100" w:afterAutospacing="1" w:line="240" w:lineRule="auto"/>
+    </w:pPr>
+    <w:rPr>
+      <w:rFonts w:ascii="Times New Roman" w:eastAsia="Times New Roman" w:hAnsi="Times New Roman" w:cs="Times New Roman"/>
+      <w:kern w:val="0"/>
+      <w:lang w:eastAsia="en-GB"/>
+      <w14:ligatures w14:val="none"/>
+    </w:rPr>
+  </w:style>
+  <w:style w:type="character" w:customStyle="1" w:styleId="d813de27">
+    <w:name w:val="d813de27"/>
+    <w:basedOn w:val="DefaultParagraphFont"/>
+    <w:rsid w:val="00BF720B"/>
+  </w:style>
+  <w:style w:type="paragraph" w:styleId="HTMLPreformatted">
+    <w:name w:val="HTML Preformatted"/>
+    <w:basedOn w:val="Normal"/>
+    <w:link w:val="HTMLPreformattedChar"/>
+    <w:uiPriority w:val="99"/>
+    <w:semiHidden/>
+    <w:unhideWhenUsed/>
+    <w:rsid w:val="00BF720B"/>
+    <w:pPr>
+      <w:tabs>
+        <w:tab w:val="left" w:pos="916"/>
+        <w:tab w:val="left" w:pos="1832"/>
+        <w:tab w:val="left" w:pos="2748"/>
+        <w:tab w:val="left" w:pos="3664"/>
+        <w:tab w:val="left" w:pos="4580"/>
+        <w:tab w:val="left" w:pos="5496"/>
+        <w:tab w:val="left" w:pos="6412"/>
+        <w:tab w:val="left" w:pos="7328"/>
+        <w:tab w:val="left" w:pos="8244"/>
+        <w:tab w:val="left" w:pos="9160"/>
+        <w:tab w:val="left" w:pos="10076"/>
+        <w:tab w:val="left" w:pos="10992"/>
+        <w:tab w:val="left" w:pos="11908"/>
+        <w:tab w:val="left" w:pos="12824"/>
+        <w:tab w:val="left" w:pos="13740"/>
+        <w:tab w:val="left" w:pos="14656"/>
+      </w:tabs>
+      <w:spacing w:after="0" w:line="240" w:lineRule="auto"/>
+    </w:pPr>
+    <w:rPr>
+      <w:rFonts w:ascii="Courier New" w:eastAsia="Times New Roman" w:hAnsi="Courier New" w:cs="Courier New"/>
+      <w:kern w:val="0"/>
+      <w:sz w:val="20"/>
+      <w:szCs w:val="20"/>
+      <w:lang w:eastAsia="en-GB"/>
+      <w14:ligatures w14:val="none"/>
+    </w:rPr>
+  </w:style>
+  <w:style w:type="character" w:customStyle="1" w:styleId="HTMLPreformattedChar">
+    <w:name w:val="HTML Preformatted Char"/>
+    <w:basedOn w:val="DefaultParagraphFont"/>
+    <w:link w:val="HTMLPreformatted"/>
+    <w:uiPriority w:val="99"/>
+    <w:semiHidden/>
+    <w:rsid w:val="00BF720B"/>
+    <w:rPr>
+      <w:rFonts w:ascii="Courier New" w:eastAsia="Times New Roman" w:hAnsi="Courier New" w:cs="Courier New"/>
+      <w:kern w:val="0"/>
+      <w:sz w:val="20"/>
+      <w:szCs w:val="20"/>
+      <w:lang w:eastAsia="en-GB"/>
+      <w14:ligatures w14:val="none"/>
+    </w:rPr>
+  </w:style>
+  <w:style w:type="character" w:customStyle="1" w:styleId="token">
+    <w:name w:val="token"/>
+    <w:basedOn w:val="DefaultParagraphFont"/>
+    <w:rsid w:val="00BF720B"/>
+  </w:style>
+  <w:style w:type="paragraph" w:styleId="Header">
+    <w:name w:val="header"/>
+    <w:basedOn w:val="Normal"/>
+    <w:link w:val="HeaderChar"/>
+    <w:uiPriority w:val="99"/>
+    <w:unhideWhenUsed/>
+    <w:rsid w:val="007D2402"/>
+    <w:pPr>
+      <w:tabs>
+        <w:tab w:val="center" w:pos="4513"/>
+        <w:tab w:val="right" w:pos="9026"/>
+      </w:tabs>
+      <w:spacing w:after="0" w:line="240" w:lineRule="auto"/>
+    </w:pPr>
+  </w:style>
+  <w:style w:type="character" w:customStyle="1" w:styleId="HeaderChar">
+    <w:name w:val="Header Char"/>
+    <w:basedOn w:val="DefaultParagraphFont"/>
+    <w:link w:val="Header"/>
+    <w:uiPriority w:val="99"/>
+    <w:rsid w:val="007D2402"/>
+  </w:style>
 </w:styles>
 </file>
 

</xml_diff>